<commit_message>
feat: R24 submission package — BOOK print master, softcopy, deck; report generator compliance fixes
🤖 Generated with Codebuff
Co-Authored-By: Codebuff <noreply@codebuff.com>
</commit_message>
<xml_diff>
--- a/report/DOCUMENTATION_UPDATED.docx
+++ b/report/DOCUMENTATION_UPDATED.docx
@@ -297,7 +297,7 @@
           <w:i w:val="0"/>
           <w:sz w:val="24"/>
         </w:rPr>
-        <w:t>October, 2025</w:t>
+        <w:t>October, 2026</w:t>
       </w:r>
     </w:p>
     <w:p>
@@ -333,7 +333,7 @@
         </w:rPr>
         <w:t>This is to certify that the project entitled "SMARTGARBAGE CHINTALAVALASA: Community-Based Smart Waste Management</w:t>
         <w:br/>
-        <w:t>and Digital Governance System" is the bonafide work carried out by MOPADA JAGANMOHAN (24331A4441), LATCHUPATULA RESHMA (24331A4434), PATI NARASIMHA MURTHY (24331A4446), KADA AUGUSTTN PAUL KUMAR (24331A4426) of B.Tech V Sem CSE-DS, 2025-2026, M.V.G.R. College of Engineering (Autonomous), Vizianagaram, during the academic year 2025-2026, in partial fulfilment of the requirements for the award of the Degree of Bachelor of Technology and that the project has not formed the basis for the award previously of any degree or any other similar title.</w:t>
+        <w:t>and Digital Governance System" is the bonafide work carried out by MOPADA JAGANMOHAN (24331A4441), LATCHUPATULA RESHMA (24331A4434), PATI NARASIMHA MURTHY (24331A4446), KADA AUGUSTTN PAUL KUMAR (24331A4426) of B.Tech V Sem CSE-DS, 2026-2027, M.V.G.R. College of Engineering (Autonomous), Vizianagaram, during the academic year 2026-2027, in partial fulfilment of the requirements for the award of the Degree of Bachelor of Technology and that the project has not formed the basis for the award previously of any degree or any other similar title.</w:t>
       </w:r>
     </w:p>
     <w:p/>
@@ -663,614 +663,6 @@
           <w:sz w:val="24"/>
         </w:rPr>
         <w:t>Waste management in Indian gram panchayats predominantly relies on phone calls and WhatsApp groups, leaving residents without schedule visibility, formal complaint tracking, or performance transparency. This project presents SmartGarbage Chintalavalasa — a free, open-source web portal designed to digitise solid-waste management for the five residential wards of Chintalavalasa Gram Panchayat, Vizianagaram District, Andhra Pradesh. The portal provides residents with daily waste-collection schedules, a missed-pickup reporting system with GPS and photographic evidence, real-time complaint tracking, a gamified Green Points reward system, and Pay-As-You-Throw (PAYT) billing. IoT-enabled smart bins transmit fill-level data to the portal, and a RandomForestRegressor machine learning model predicts bin overflow probability. The system is built on Python/Flask with a Supabase PostgreSQL database, comprising 23 database models, 29 Alembic migrations, and 359 automated tests. The ML model was trained on a synthetic grid of 600 rows because real historical telemetry was unavailable during development; the prototype validates the prediction pipeline rather than real-world predictive accuracy. Security hardening follows OWASP recommendations with nine security headers. Accessibility features include 81 ARIA attributes, text resize controls, high contrast toggle, and dark mode. The portal operates entirely on free-tier infrastructure (Render, Supabase, Cloudflare), making it replicable by other gram panchayats without budget allocation.</w:t>
-      </w:r>
-    </w:p>
-    <w:p>
-      <w:r>
-        <w:br w:type="page"/>
-      </w:r>
-    </w:p>
-    <w:p>
-      <w:pPr>
-        <w:pStyle w:val="Heading1"/>
-        <w:spacing w:before="240" w:after="120"/>
-      </w:pPr>
-      <w:r>
-        <w:rPr>
-          <w:rFonts w:ascii="Times New Roman" w:hAnsi="Times New Roman"/>
-          <w:b/>
-          <w:color w:val="000000"/>
-          <w:sz w:val="32"/>
-        </w:rPr>
-        <w:t>TABLE OF CONTENTS</w:t>
-      </w:r>
-    </w:p>
-    <w:p>
-      <w:pPr>
-        <w:spacing w:line="360" w:lineRule="exact"/>
-      </w:pPr>
-      <w:r>
-        <w:rPr>
-          <w:rFonts w:ascii="Times New Roman" w:hAnsi="Times New Roman"/>
-          <w:sz w:val="24"/>
-        </w:rPr>
-        <w:t>List of Abbreviations</w:t>
-      </w:r>
-    </w:p>
-    <w:p>
-      <w:pPr>
-        <w:spacing w:line="360" w:lineRule="exact"/>
-      </w:pPr>
-      <w:r>
-        <w:rPr>
-          <w:rFonts w:ascii="Times New Roman" w:hAnsi="Times New Roman"/>
-          <w:sz w:val="24"/>
-        </w:rPr>
-        <w:t>List of Figures</w:t>
-      </w:r>
-    </w:p>
-    <w:p>
-      <w:pPr>
-        <w:spacing w:line="360" w:lineRule="exact"/>
-      </w:pPr>
-      <w:r>
-        <w:rPr>
-          <w:rFonts w:ascii="Times New Roman" w:hAnsi="Times New Roman"/>
-          <w:sz w:val="24"/>
-        </w:rPr>
-        <w:t>List of Tables</w:t>
-      </w:r>
-    </w:p>
-    <w:p>
-      <w:pPr>
-        <w:spacing w:line="360" w:lineRule="exact"/>
-      </w:pPr>
-      <w:r>
-        <w:rPr>
-          <w:rFonts w:ascii="Times New Roman" w:hAnsi="Times New Roman"/>
-          <w:sz w:val="24"/>
-        </w:rPr>
-        <w:t>1. Introduction</w:t>
-      </w:r>
-    </w:p>
-    <w:p>
-      <w:pPr>
-        <w:spacing w:line="360" w:lineRule="exact"/>
-      </w:pPr>
-      <w:r>
-        <w:rPr>
-          <w:rFonts w:ascii="Times New Roman" w:hAnsi="Times New Roman"/>
-          <w:sz w:val="24"/>
-        </w:rPr>
-        <w:t xml:space="preserve">    1.1 Problem Statement</w:t>
-      </w:r>
-    </w:p>
-    <w:p>
-      <w:pPr>
-        <w:spacing w:line="360" w:lineRule="exact"/>
-      </w:pPr>
-      <w:r>
-        <w:rPr>
-          <w:rFonts w:ascii="Times New Roman" w:hAnsi="Times New Roman"/>
-          <w:sz w:val="24"/>
-        </w:rPr>
-        <w:t xml:space="preserve">    1.2 Project Objective</w:t>
-      </w:r>
-    </w:p>
-    <w:p>
-      <w:pPr>
-        <w:spacing w:line="360" w:lineRule="exact"/>
-      </w:pPr>
-      <w:r>
-        <w:rPr>
-          <w:rFonts w:ascii="Times New Roman" w:hAnsi="Times New Roman"/>
-          <w:sz w:val="24"/>
-        </w:rPr>
-        <w:t xml:space="preserve">    1.3 Scope</w:t>
-      </w:r>
-    </w:p>
-    <w:p>
-      <w:pPr>
-        <w:spacing w:line="360" w:lineRule="exact"/>
-      </w:pPr>
-      <w:r>
-        <w:rPr>
-          <w:rFonts w:ascii="Times New Roman" w:hAnsi="Times New Roman"/>
-          <w:sz w:val="24"/>
-        </w:rPr>
-        <w:t>2. Literature Survey</w:t>
-      </w:r>
-    </w:p>
-    <w:p>
-      <w:pPr>
-        <w:spacing w:line="360" w:lineRule="exact"/>
-      </w:pPr>
-      <w:r>
-        <w:rPr>
-          <w:rFonts w:ascii="Times New Roman" w:hAnsi="Times New Roman"/>
-          <w:sz w:val="24"/>
-        </w:rPr>
-        <w:t xml:space="preserve">    2.1 Existing Approaches</w:t>
-      </w:r>
-    </w:p>
-    <w:p>
-      <w:pPr>
-        <w:spacing w:line="360" w:lineRule="exact"/>
-      </w:pPr>
-      <w:r>
-        <w:rPr>
-          <w:rFonts w:ascii="Times New Roman" w:hAnsi="Times New Roman"/>
-          <w:sz w:val="24"/>
-        </w:rPr>
-        <w:t xml:space="preserve">    2.2 Digital Solutions</w:t>
-      </w:r>
-    </w:p>
-    <w:p>
-      <w:pPr>
-        <w:spacing w:line="360" w:lineRule="exact"/>
-      </w:pPr>
-      <w:r>
-        <w:rPr>
-          <w:rFonts w:ascii="Times New Roman" w:hAnsi="Times New Roman"/>
-          <w:sz w:val="24"/>
-        </w:rPr>
-        <w:t xml:space="preserve">    2.3 IoT and ML</w:t>
-      </w:r>
-    </w:p>
-    <w:p>
-      <w:pPr>
-        <w:spacing w:line="360" w:lineRule="exact"/>
-      </w:pPr>
-      <w:r>
-        <w:rPr>
-          <w:rFonts w:ascii="Times New Roman" w:hAnsi="Times New Roman"/>
-          <w:sz w:val="24"/>
-        </w:rPr>
-        <w:t xml:space="preserve">    2.4 Research Gap</w:t>
-      </w:r>
-    </w:p>
-    <w:p>
-      <w:pPr>
-        <w:spacing w:line="360" w:lineRule="exact"/>
-      </w:pPr>
-      <w:r>
-        <w:rPr>
-          <w:rFonts w:ascii="Times New Roman" w:hAnsi="Times New Roman"/>
-          <w:sz w:val="24"/>
-        </w:rPr>
-        <w:t>3. Data Gathering / Data Used</w:t>
-      </w:r>
-    </w:p>
-    <w:p>
-      <w:pPr>
-        <w:spacing w:line="360" w:lineRule="exact"/>
-      </w:pPr>
-      <w:r>
-        <w:rPr>
-          <w:rFonts w:ascii="Times New Roman" w:hAnsi="Times New Roman"/>
-          <w:sz w:val="24"/>
-        </w:rPr>
-        <w:t xml:space="preserve">    3.1 Study Area</w:t>
-      </w:r>
-    </w:p>
-    <w:p>
-      <w:pPr>
-        <w:spacing w:line="360" w:lineRule="exact"/>
-      </w:pPr>
-      <w:r>
-        <w:rPr>
-          <w:rFonts w:ascii="Times New Roman" w:hAnsi="Times New Roman"/>
-          <w:sz w:val="24"/>
-        </w:rPr>
-        <w:t xml:space="preserve">    3.2 Data Sources</w:t>
-      </w:r>
-    </w:p>
-    <w:p>
-      <w:pPr>
-        <w:spacing w:line="360" w:lineRule="exact"/>
-      </w:pPr>
-      <w:r>
-        <w:rPr>
-          <w:rFonts w:ascii="Times New Roman" w:hAnsi="Times New Roman"/>
-          <w:sz w:val="24"/>
-        </w:rPr>
-        <w:t xml:space="preserve">    3.3 Ward Information</w:t>
-      </w:r>
-    </w:p>
-    <w:p>
-      <w:pPr>
-        <w:spacing w:line="360" w:lineRule="exact"/>
-      </w:pPr>
-      <w:r>
-        <w:rPr>
-          <w:rFonts w:ascii="Times New Roman" w:hAnsi="Times New Roman"/>
-          <w:sz w:val="24"/>
-        </w:rPr>
-        <w:t xml:space="preserve">    3.4 Data Preparation</w:t>
-      </w:r>
-    </w:p>
-    <w:p>
-      <w:pPr>
-        <w:spacing w:line="360" w:lineRule="exact"/>
-      </w:pPr>
-      <w:r>
-        <w:rPr>
-          <w:rFonts w:ascii="Times New Roman" w:hAnsi="Times New Roman"/>
-          <w:sz w:val="24"/>
-        </w:rPr>
-        <w:t xml:space="preserve">    3.5 Database Design</w:t>
-      </w:r>
-    </w:p>
-    <w:p>
-      <w:pPr>
-        <w:spacing w:line="360" w:lineRule="exact"/>
-      </w:pPr>
-      <w:r>
-        <w:rPr>
-          <w:rFonts w:ascii="Times New Roman" w:hAnsi="Times New Roman"/>
-          <w:sz w:val="24"/>
-        </w:rPr>
-        <w:t>4. Methodology / System Design</w:t>
-      </w:r>
-    </w:p>
-    <w:p>
-      <w:pPr>
-        <w:spacing w:line="360" w:lineRule="exact"/>
-      </w:pPr>
-      <w:r>
-        <w:rPr>
-          <w:rFonts w:ascii="Times New Roman" w:hAnsi="Times New Roman"/>
-          <w:sz w:val="24"/>
-        </w:rPr>
-        <w:t xml:space="preserve">    4.1 Requirement Analysis</w:t>
-      </w:r>
-    </w:p>
-    <w:p>
-      <w:pPr>
-        <w:spacing w:line="360" w:lineRule="exact"/>
-      </w:pPr>
-      <w:r>
-        <w:rPr>
-          <w:rFonts w:ascii="Times New Roman" w:hAnsi="Times New Roman"/>
-          <w:sz w:val="24"/>
-        </w:rPr>
-        <w:t xml:space="preserve">    4.2 System Architecture</w:t>
-      </w:r>
-    </w:p>
-    <w:p>
-      <w:pPr>
-        <w:spacing w:line="360" w:lineRule="exact"/>
-      </w:pPr>
-      <w:r>
-        <w:rPr>
-          <w:rFonts w:ascii="Times New Roman" w:hAnsi="Times New Roman"/>
-          <w:sz w:val="24"/>
-        </w:rPr>
-        <w:t xml:space="preserve">    4.3 System Workflow</w:t>
-      </w:r>
-    </w:p>
-    <w:p>
-      <w:pPr>
-        <w:spacing w:line="360" w:lineRule="exact"/>
-      </w:pPr>
-      <w:r>
-        <w:rPr>
-          <w:rFonts w:ascii="Times New Roman" w:hAnsi="Times New Roman"/>
-          <w:sz w:val="24"/>
-        </w:rPr>
-        <w:t xml:space="preserve">    4.4 Technology Stack</w:t>
-      </w:r>
-    </w:p>
-    <w:p>
-      <w:pPr>
-        <w:spacing w:line="360" w:lineRule="exact"/>
-      </w:pPr>
-      <w:r>
-        <w:rPr>
-          <w:rFonts w:ascii="Times New Roman" w:hAnsi="Times New Roman"/>
-          <w:sz w:val="24"/>
-        </w:rPr>
-        <w:t xml:space="preserve">    4.5 ML Methodology</w:t>
-      </w:r>
-    </w:p>
-    <w:p>
-      <w:pPr>
-        <w:spacing w:line="360" w:lineRule="exact"/>
-      </w:pPr>
-      <w:r>
-        <w:rPr>
-          <w:rFonts w:ascii="Times New Roman" w:hAnsi="Times New Roman"/>
-          <w:sz w:val="24"/>
-        </w:rPr>
-        <w:t xml:space="preserve">    4.6 IoT Methodology</w:t>
-      </w:r>
-    </w:p>
-    <w:p>
-      <w:pPr>
-        <w:spacing w:line="360" w:lineRule="exact"/>
-      </w:pPr>
-      <w:r>
-        <w:rPr>
-          <w:rFonts w:ascii="Times New Roman" w:hAnsi="Times New Roman"/>
-          <w:sz w:val="24"/>
-        </w:rPr>
-        <w:t xml:space="preserve">    4.7 Security</w:t>
-      </w:r>
-    </w:p>
-    <w:p>
-      <w:pPr>
-        <w:spacing w:line="360" w:lineRule="exact"/>
-      </w:pPr>
-      <w:r>
-        <w:rPr>
-          <w:rFonts w:ascii="Times New Roman" w:hAnsi="Times New Roman"/>
-          <w:sz w:val="24"/>
-        </w:rPr>
-        <w:t xml:space="preserve">    4.8 PWA / Offline</w:t>
-      </w:r>
-    </w:p>
-    <w:p>
-      <w:pPr>
-        <w:spacing w:line="360" w:lineRule="exact"/>
-      </w:pPr>
-      <w:r>
-        <w:rPr>
-          <w:rFonts w:ascii="Times New Roman" w:hAnsi="Times New Roman"/>
-          <w:sz w:val="24"/>
-        </w:rPr>
-        <w:t>5. Implementation / Modules</w:t>
-      </w:r>
-    </w:p>
-    <w:p>
-      <w:pPr>
-        <w:spacing w:line="360" w:lineRule="exact"/>
-      </w:pPr>
-      <w:r>
-        <w:rPr>
-          <w:rFonts w:ascii="Times New Roman" w:hAnsi="Times New Roman"/>
-          <w:sz w:val="24"/>
-        </w:rPr>
-        <w:t xml:space="preserve">    5.1 Public Portal</w:t>
-      </w:r>
-    </w:p>
-    <w:p>
-      <w:pPr>
-        <w:spacing w:line="360" w:lineRule="exact"/>
-      </w:pPr>
-      <w:r>
-        <w:rPr>
-          <w:rFonts w:ascii="Times New Roman" w:hAnsi="Times New Roman"/>
-          <w:sz w:val="24"/>
-        </w:rPr>
-        <w:t xml:space="preserve">    5.2 Citizen Portal</w:t>
-      </w:r>
-    </w:p>
-    <w:p>
-      <w:pPr>
-        <w:spacing w:line="360" w:lineRule="exact"/>
-      </w:pPr>
-      <w:r>
-        <w:rPr>
-          <w:rFonts w:ascii="Times New Roman" w:hAnsi="Times New Roman"/>
-          <w:sz w:val="24"/>
-        </w:rPr>
-        <w:t xml:space="preserve">    5.3 Admin Portal</w:t>
-      </w:r>
-    </w:p>
-    <w:p>
-      <w:pPr>
-        <w:spacing w:line="360" w:lineRule="exact"/>
-      </w:pPr>
-      <w:r>
-        <w:rPr>
-          <w:rFonts w:ascii="Times New Roman" w:hAnsi="Times New Roman"/>
-          <w:sz w:val="24"/>
-        </w:rPr>
-        <w:t xml:space="preserve">    5.4 Worker Portal</w:t>
-      </w:r>
-    </w:p>
-    <w:p>
-      <w:pPr>
-        <w:spacing w:line="360" w:lineRule="exact"/>
-      </w:pPr>
-      <w:r>
-        <w:rPr>
-          <w:rFonts w:ascii="Times New Roman" w:hAnsi="Times New Roman"/>
-          <w:sz w:val="24"/>
-        </w:rPr>
-        <w:t xml:space="preserve">    5.5 IoT Module</w:t>
-      </w:r>
-    </w:p>
-    <w:p>
-      <w:pPr>
-        <w:spacing w:line="360" w:lineRule="exact"/>
-      </w:pPr>
-      <w:r>
-        <w:rPr>
-          <w:rFonts w:ascii="Times New Roman" w:hAnsi="Times New Roman"/>
-          <w:sz w:val="24"/>
-        </w:rPr>
-        <w:t xml:space="preserve">    5.6 ML Module</w:t>
-      </w:r>
-    </w:p>
-    <w:p>
-      <w:pPr>
-        <w:spacing w:line="360" w:lineRule="exact"/>
-      </w:pPr>
-      <w:r>
-        <w:rPr>
-          <w:rFonts w:ascii="Times New Roman" w:hAnsi="Times New Roman"/>
-          <w:sz w:val="24"/>
-        </w:rPr>
-        <w:t xml:space="preserve">    5.7 Background Jobs</w:t>
-      </w:r>
-    </w:p>
-    <w:p>
-      <w:pPr>
-        <w:spacing w:line="360" w:lineRule="exact"/>
-      </w:pPr>
-      <w:r>
-        <w:rPr>
-          <w:rFonts w:ascii="Times New Roman" w:hAnsi="Times New Roman"/>
-          <w:sz w:val="24"/>
-        </w:rPr>
-        <w:t xml:space="preserve">    5.8 PWA Module</w:t>
-      </w:r>
-    </w:p>
-    <w:p>
-      <w:pPr>
-        <w:spacing w:line="360" w:lineRule="exact"/>
-      </w:pPr>
-      <w:r>
-        <w:rPr>
-          <w:rFonts w:ascii="Times New Roman" w:hAnsi="Times New Roman"/>
-          <w:sz w:val="24"/>
-        </w:rPr>
-        <w:t>6. Results / Outputs</w:t>
-      </w:r>
-    </w:p>
-    <w:p>
-      <w:pPr>
-        <w:spacing w:line="360" w:lineRule="exact"/>
-      </w:pPr>
-      <w:r>
-        <w:rPr>
-          <w:rFonts w:ascii="Times New Roman" w:hAnsi="Times New Roman"/>
-          <w:sz w:val="24"/>
-        </w:rPr>
-        <w:t xml:space="preserve">    6.1 Feature Status</w:t>
-      </w:r>
-    </w:p>
-    <w:p>
-      <w:pPr>
-        <w:spacing w:line="360" w:lineRule="exact"/>
-      </w:pPr>
-      <w:r>
-        <w:rPr>
-          <w:rFonts w:ascii="Times New Roman" w:hAnsi="Times New Roman"/>
-          <w:sz w:val="24"/>
-        </w:rPr>
-        <w:t xml:space="preserve">    6.2 System Outputs</w:t>
-      </w:r>
-    </w:p>
-    <w:p>
-      <w:pPr>
-        <w:spacing w:line="360" w:lineRule="exact"/>
-      </w:pPr>
-      <w:r>
-        <w:rPr>
-          <w:rFonts w:ascii="Times New Roman" w:hAnsi="Times New Roman"/>
-          <w:sz w:val="24"/>
-        </w:rPr>
-        <w:t xml:space="preserve">    6.3 Performance Metrics</w:t>
-      </w:r>
-    </w:p>
-    <w:p>
-      <w:pPr>
-        <w:spacing w:line="360" w:lineRule="exact"/>
-      </w:pPr>
-      <w:r>
-        <w:rPr>
-          <w:rFonts w:ascii="Times New Roman" w:hAnsi="Times New Roman"/>
-          <w:sz w:val="24"/>
-        </w:rPr>
-        <w:t xml:space="preserve">    6.4 Security Evaluation</w:t>
-      </w:r>
-    </w:p>
-    <w:p>
-      <w:pPr>
-        <w:spacing w:line="360" w:lineRule="exact"/>
-      </w:pPr>
-      <w:r>
-        <w:rPr>
-          <w:rFonts w:ascii="Times New Roman" w:hAnsi="Times New Roman"/>
-          <w:sz w:val="24"/>
-        </w:rPr>
-        <w:t xml:space="preserve">    6.5 Accessibility</w:t>
-      </w:r>
-    </w:p>
-    <w:p>
-      <w:pPr>
-        <w:spacing w:line="360" w:lineRule="exact"/>
-      </w:pPr>
-      <w:r>
-        <w:rPr>
-          <w:rFonts w:ascii="Times New Roman" w:hAnsi="Times New Roman"/>
-          <w:sz w:val="24"/>
-        </w:rPr>
-        <w:t>7. Impact Assessment</w:t>
-      </w:r>
-    </w:p>
-    <w:p>
-      <w:pPr>
-        <w:spacing w:line="360" w:lineRule="exact"/>
-      </w:pPr>
-      <w:r>
-        <w:rPr>
-          <w:rFonts w:ascii="Times New Roman" w:hAnsi="Times New Roman"/>
-          <w:sz w:val="24"/>
-        </w:rPr>
-        <w:t>8. Challenges Faced</w:t>
-      </w:r>
-    </w:p>
-    <w:p>
-      <w:pPr>
-        <w:spacing w:line="360" w:lineRule="exact"/>
-      </w:pPr>
-      <w:r>
-        <w:rPr>
-          <w:rFonts w:ascii="Times New Roman" w:hAnsi="Times New Roman"/>
-          <w:sz w:val="24"/>
-        </w:rPr>
-        <w:t>9. Conclusion</w:t>
-      </w:r>
-    </w:p>
-    <w:p>
-      <w:pPr>
-        <w:spacing w:line="360" w:lineRule="exact"/>
-      </w:pPr>
-      <w:r>
-        <w:rPr>
-          <w:rFonts w:ascii="Times New Roman" w:hAnsi="Times New Roman"/>
-          <w:sz w:val="24"/>
-        </w:rPr>
-        <w:t>10. Future Work</w:t>
-      </w:r>
-    </w:p>
-    <w:p>
-      <w:pPr>
-        <w:spacing w:line="360" w:lineRule="exact"/>
-      </w:pPr>
-      <w:r>
-        <w:rPr>
-          <w:rFonts w:ascii="Times New Roman" w:hAnsi="Times New Roman"/>
-          <w:sz w:val="24"/>
-        </w:rPr>
-        <w:t>References</w:t>
-      </w:r>
-    </w:p>
-    <w:p>
-      <w:pPr>
-        <w:spacing w:line="360" w:lineRule="exact"/>
-      </w:pPr>
-      <w:r>
-        <w:rPr>
-          <w:rFonts w:ascii="Times New Roman" w:hAnsi="Times New Roman"/>
-          <w:sz w:val="24"/>
-        </w:rPr>
-        <w:t>Appendix A: Tools and Packages</w:t>
-      </w:r>
-    </w:p>
-    <w:p>
-      <w:pPr>
-        <w:spacing w:line="360" w:lineRule="exact"/>
-      </w:pPr>
-      <w:r>
-        <w:rPr>
-          <w:rFonts w:ascii="Times New Roman" w:hAnsi="Times New Roman"/>
-          <w:sz w:val="24"/>
-        </w:rPr>
-        <w:t>Appendix B: Source Code</w:t>
       </w:r>
     </w:p>
     <w:p>
@@ -2970,6 +2362,78 @@
                 <w:rFonts w:ascii="Times New Roman" w:hAnsi="Times New Roman"/>
                 <w:sz w:val="24"/>
               </w:rPr>
+              <w:t>Table 6.6</w:t>
+            </w:r>
+          </w:p>
+        </w:tc>
+        <w:tc>
+          <w:tcPr>
+            <w:tcW w:type="dxa" w:w="4501"/>
+          </w:tcPr>
+          <w:p>
+            <w:pPr>
+              <w:spacing w:line="280" w:lineRule="exact"/>
+            </w:pPr>
+            <w:r>
+              <w:rPr>
+                <w:rFonts w:ascii="Times New Roman" w:hAnsi="Times New Roman"/>
+                <w:sz w:val="24"/>
+              </w:rPr>
+              <w:t>Photo-Validation Classifier Evaluation</w:t>
+            </w:r>
+          </w:p>
+        </w:tc>
+      </w:tr>
+      <w:tr>
+        <w:tc>
+          <w:tcPr>
+            <w:tcW w:type="dxa" w:w="4501"/>
+          </w:tcPr>
+          <w:p>
+            <w:pPr>
+              <w:spacing w:line="280" w:lineRule="exact"/>
+            </w:pPr>
+            <w:r>
+              <w:rPr>
+                <w:rFonts w:ascii="Times New Roman" w:hAnsi="Times New Roman"/>
+                <w:sz w:val="24"/>
+              </w:rPr>
+              <w:t>Table 6.7</w:t>
+            </w:r>
+          </w:p>
+        </w:tc>
+        <w:tc>
+          <w:tcPr>
+            <w:tcW w:type="dxa" w:w="4501"/>
+          </w:tcPr>
+          <w:p>
+            <w:pPr>
+              <w:spacing w:line="280" w:lineRule="exact"/>
+            </w:pPr>
+            <w:r>
+              <w:rPr>
+                <w:rFonts w:ascii="Times New Roman" w:hAnsi="Times New Roman"/>
+                <w:sz w:val="24"/>
+              </w:rPr>
+              <w:t>Classifier Reliability Safeguards</w:t>
+            </w:r>
+          </w:p>
+        </w:tc>
+      </w:tr>
+      <w:tr>
+        <w:tc>
+          <w:tcPr>
+            <w:tcW w:type="dxa" w:w="4501"/>
+          </w:tcPr>
+          <w:p>
+            <w:pPr>
+              <w:spacing w:line="280" w:lineRule="exact"/>
+            </w:pPr>
+            <w:r>
+              <w:rPr>
+                <w:rFonts w:ascii="Times New Roman" w:hAnsi="Times New Roman"/>
+                <w:sz w:val="24"/>
+              </w:rPr>
               <w:t>Table 7.1</w:t>
             </w:r>
           </w:p>
@@ -3043,6 +2507,614 @@
       </w:r>
     </w:p>
     <w:p/>
+    <w:p>
+      <w:r>
+        <w:br w:type="page"/>
+      </w:r>
+    </w:p>
+    <w:p>
+      <w:pPr>
+        <w:pStyle w:val="Heading1"/>
+        <w:spacing w:before="240" w:after="120"/>
+      </w:pPr>
+      <w:r>
+        <w:rPr>
+          <w:rFonts w:ascii="Times New Roman" w:hAnsi="Times New Roman"/>
+          <w:b/>
+          <w:color w:val="000000"/>
+          <w:sz w:val="32"/>
+        </w:rPr>
+        <w:t>TABLE OF CONTENTS</w:t>
+      </w:r>
+    </w:p>
+    <w:p>
+      <w:pPr>
+        <w:spacing w:line="360" w:lineRule="exact"/>
+      </w:pPr>
+      <w:r>
+        <w:rPr>
+          <w:rFonts w:ascii="Times New Roman" w:hAnsi="Times New Roman"/>
+          <w:sz w:val="24"/>
+        </w:rPr>
+        <w:t>List of Abbreviations</w:t>
+      </w:r>
+    </w:p>
+    <w:p>
+      <w:pPr>
+        <w:spacing w:line="360" w:lineRule="exact"/>
+      </w:pPr>
+      <w:r>
+        <w:rPr>
+          <w:rFonts w:ascii="Times New Roman" w:hAnsi="Times New Roman"/>
+          <w:sz w:val="24"/>
+        </w:rPr>
+        <w:t>List of Figures</w:t>
+      </w:r>
+    </w:p>
+    <w:p>
+      <w:pPr>
+        <w:spacing w:line="360" w:lineRule="exact"/>
+      </w:pPr>
+      <w:r>
+        <w:rPr>
+          <w:rFonts w:ascii="Times New Roman" w:hAnsi="Times New Roman"/>
+          <w:sz w:val="24"/>
+        </w:rPr>
+        <w:t>List of Tables</w:t>
+      </w:r>
+    </w:p>
+    <w:p>
+      <w:pPr>
+        <w:spacing w:line="360" w:lineRule="exact"/>
+      </w:pPr>
+      <w:r>
+        <w:rPr>
+          <w:rFonts w:ascii="Times New Roman" w:hAnsi="Times New Roman"/>
+          <w:sz w:val="24"/>
+        </w:rPr>
+        <w:t>1. Introduction</w:t>
+      </w:r>
+    </w:p>
+    <w:p>
+      <w:pPr>
+        <w:spacing w:line="360" w:lineRule="exact"/>
+      </w:pPr>
+      <w:r>
+        <w:rPr>
+          <w:rFonts w:ascii="Times New Roman" w:hAnsi="Times New Roman"/>
+          <w:sz w:val="24"/>
+        </w:rPr>
+        <w:t xml:space="preserve">    1.1 Problem Statement</w:t>
+      </w:r>
+    </w:p>
+    <w:p>
+      <w:pPr>
+        <w:spacing w:line="360" w:lineRule="exact"/>
+      </w:pPr>
+      <w:r>
+        <w:rPr>
+          <w:rFonts w:ascii="Times New Roman" w:hAnsi="Times New Roman"/>
+          <w:sz w:val="24"/>
+        </w:rPr>
+        <w:t xml:space="preserve">    1.2 Project Objective</w:t>
+      </w:r>
+    </w:p>
+    <w:p>
+      <w:pPr>
+        <w:spacing w:line="360" w:lineRule="exact"/>
+      </w:pPr>
+      <w:r>
+        <w:rPr>
+          <w:rFonts w:ascii="Times New Roman" w:hAnsi="Times New Roman"/>
+          <w:sz w:val="24"/>
+        </w:rPr>
+        <w:t xml:space="preserve">    1.3 Scope</w:t>
+      </w:r>
+    </w:p>
+    <w:p>
+      <w:pPr>
+        <w:spacing w:line="360" w:lineRule="exact"/>
+      </w:pPr>
+      <w:r>
+        <w:rPr>
+          <w:rFonts w:ascii="Times New Roman" w:hAnsi="Times New Roman"/>
+          <w:sz w:val="24"/>
+        </w:rPr>
+        <w:t>2. Literature Survey</w:t>
+      </w:r>
+    </w:p>
+    <w:p>
+      <w:pPr>
+        <w:spacing w:line="360" w:lineRule="exact"/>
+      </w:pPr>
+      <w:r>
+        <w:rPr>
+          <w:rFonts w:ascii="Times New Roman" w:hAnsi="Times New Roman"/>
+          <w:sz w:val="24"/>
+        </w:rPr>
+        <w:t xml:space="preserve">    2.1 Existing Approaches</w:t>
+      </w:r>
+    </w:p>
+    <w:p>
+      <w:pPr>
+        <w:spacing w:line="360" w:lineRule="exact"/>
+      </w:pPr>
+      <w:r>
+        <w:rPr>
+          <w:rFonts w:ascii="Times New Roman" w:hAnsi="Times New Roman"/>
+          <w:sz w:val="24"/>
+        </w:rPr>
+        <w:t xml:space="preserve">    2.2 Digital Solutions</w:t>
+      </w:r>
+    </w:p>
+    <w:p>
+      <w:pPr>
+        <w:spacing w:line="360" w:lineRule="exact"/>
+      </w:pPr>
+      <w:r>
+        <w:rPr>
+          <w:rFonts w:ascii="Times New Roman" w:hAnsi="Times New Roman"/>
+          <w:sz w:val="24"/>
+        </w:rPr>
+        <w:t xml:space="preserve">    2.3 IoT and ML</w:t>
+      </w:r>
+    </w:p>
+    <w:p>
+      <w:pPr>
+        <w:spacing w:line="360" w:lineRule="exact"/>
+      </w:pPr>
+      <w:r>
+        <w:rPr>
+          <w:rFonts w:ascii="Times New Roman" w:hAnsi="Times New Roman"/>
+          <w:sz w:val="24"/>
+        </w:rPr>
+        <w:t xml:space="preserve">    2.4 Research Gap</w:t>
+      </w:r>
+    </w:p>
+    <w:p>
+      <w:pPr>
+        <w:spacing w:line="360" w:lineRule="exact"/>
+      </w:pPr>
+      <w:r>
+        <w:rPr>
+          <w:rFonts w:ascii="Times New Roman" w:hAnsi="Times New Roman"/>
+          <w:sz w:val="24"/>
+        </w:rPr>
+        <w:t>3. Data Gathering / Data Used</w:t>
+      </w:r>
+    </w:p>
+    <w:p>
+      <w:pPr>
+        <w:spacing w:line="360" w:lineRule="exact"/>
+      </w:pPr>
+      <w:r>
+        <w:rPr>
+          <w:rFonts w:ascii="Times New Roman" w:hAnsi="Times New Roman"/>
+          <w:sz w:val="24"/>
+        </w:rPr>
+        <w:t xml:space="preserve">    3.1 Study Area</w:t>
+      </w:r>
+    </w:p>
+    <w:p>
+      <w:pPr>
+        <w:spacing w:line="360" w:lineRule="exact"/>
+      </w:pPr>
+      <w:r>
+        <w:rPr>
+          <w:rFonts w:ascii="Times New Roman" w:hAnsi="Times New Roman"/>
+          <w:sz w:val="24"/>
+        </w:rPr>
+        <w:t xml:space="preserve">    3.2 Data Sources</w:t>
+      </w:r>
+    </w:p>
+    <w:p>
+      <w:pPr>
+        <w:spacing w:line="360" w:lineRule="exact"/>
+      </w:pPr>
+      <w:r>
+        <w:rPr>
+          <w:rFonts w:ascii="Times New Roman" w:hAnsi="Times New Roman"/>
+          <w:sz w:val="24"/>
+        </w:rPr>
+        <w:t xml:space="preserve">    3.3 Ward Information</w:t>
+      </w:r>
+    </w:p>
+    <w:p>
+      <w:pPr>
+        <w:spacing w:line="360" w:lineRule="exact"/>
+      </w:pPr>
+      <w:r>
+        <w:rPr>
+          <w:rFonts w:ascii="Times New Roman" w:hAnsi="Times New Roman"/>
+          <w:sz w:val="24"/>
+        </w:rPr>
+        <w:t xml:space="preserve">    3.4 Data Preparation</w:t>
+      </w:r>
+    </w:p>
+    <w:p>
+      <w:pPr>
+        <w:spacing w:line="360" w:lineRule="exact"/>
+      </w:pPr>
+      <w:r>
+        <w:rPr>
+          <w:rFonts w:ascii="Times New Roman" w:hAnsi="Times New Roman"/>
+          <w:sz w:val="24"/>
+        </w:rPr>
+        <w:t xml:space="preserve">    3.5 Database Design</w:t>
+      </w:r>
+    </w:p>
+    <w:p>
+      <w:pPr>
+        <w:spacing w:line="360" w:lineRule="exact"/>
+      </w:pPr>
+      <w:r>
+        <w:rPr>
+          <w:rFonts w:ascii="Times New Roman" w:hAnsi="Times New Roman"/>
+          <w:sz w:val="24"/>
+        </w:rPr>
+        <w:t>4. Methodology / System Design</w:t>
+      </w:r>
+    </w:p>
+    <w:p>
+      <w:pPr>
+        <w:spacing w:line="360" w:lineRule="exact"/>
+      </w:pPr>
+      <w:r>
+        <w:rPr>
+          <w:rFonts w:ascii="Times New Roman" w:hAnsi="Times New Roman"/>
+          <w:sz w:val="24"/>
+        </w:rPr>
+        <w:t xml:space="preserve">    4.1 Requirement Analysis</w:t>
+      </w:r>
+    </w:p>
+    <w:p>
+      <w:pPr>
+        <w:spacing w:line="360" w:lineRule="exact"/>
+      </w:pPr>
+      <w:r>
+        <w:rPr>
+          <w:rFonts w:ascii="Times New Roman" w:hAnsi="Times New Roman"/>
+          <w:sz w:val="24"/>
+        </w:rPr>
+        <w:t xml:space="preserve">    4.2 System Architecture</w:t>
+      </w:r>
+    </w:p>
+    <w:p>
+      <w:pPr>
+        <w:spacing w:line="360" w:lineRule="exact"/>
+      </w:pPr>
+      <w:r>
+        <w:rPr>
+          <w:rFonts w:ascii="Times New Roman" w:hAnsi="Times New Roman"/>
+          <w:sz w:val="24"/>
+        </w:rPr>
+        <w:t xml:space="preserve">    4.3 System Workflow</w:t>
+      </w:r>
+    </w:p>
+    <w:p>
+      <w:pPr>
+        <w:spacing w:line="360" w:lineRule="exact"/>
+      </w:pPr>
+      <w:r>
+        <w:rPr>
+          <w:rFonts w:ascii="Times New Roman" w:hAnsi="Times New Roman"/>
+          <w:sz w:val="24"/>
+        </w:rPr>
+        <w:t xml:space="preserve">    4.4 Technology Stack</w:t>
+      </w:r>
+    </w:p>
+    <w:p>
+      <w:pPr>
+        <w:spacing w:line="360" w:lineRule="exact"/>
+      </w:pPr>
+      <w:r>
+        <w:rPr>
+          <w:rFonts w:ascii="Times New Roman" w:hAnsi="Times New Roman"/>
+          <w:sz w:val="24"/>
+        </w:rPr>
+        <w:t xml:space="preserve">    4.5 ML Methodology</w:t>
+      </w:r>
+    </w:p>
+    <w:p>
+      <w:pPr>
+        <w:spacing w:line="360" w:lineRule="exact"/>
+      </w:pPr>
+      <w:r>
+        <w:rPr>
+          <w:rFonts w:ascii="Times New Roman" w:hAnsi="Times New Roman"/>
+          <w:sz w:val="24"/>
+        </w:rPr>
+        <w:t xml:space="preserve">    4.6 IoT Methodology</w:t>
+      </w:r>
+    </w:p>
+    <w:p>
+      <w:pPr>
+        <w:spacing w:line="360" w:lineRule="exact"/>
+      </w:pPr>
+      <w:r>
+        <w:rPr>
+          <w:rFonts w:ascii="Times New Roman" w:hAnsi="Times New Roman"/>
+          <w:sz w:val="24"/>
+        </w:rPr>
+        <w:t xml:space="preserve">    4.7 Security</w:t>
+      </w:r>
+    </w:p>
+    <w:p>
+      <w:pPr>
+        <w:spacing w:line="360" w:lineRule="exact"/>
+      </w:pPr>
+      <w:r>
+        <w:rPr>
+          <w:rFonts w:ascii="Times New Roman" w:hAnsi="Times New Roman"/>
+          <w:sz w:val="24"/>
+        </w:rPr>
+        <w:t xml:space="preserve">    4.8 PWA / Offline</w:t>
+      </w:r>
+    </w:p>
+    <w:p>
+      <w:pPr>
+        <w:spacing w:line="360" w:lineRule="exact"/>
+      </w:pPr>
+      <w:r>
+        <w:rPr>
+          <w:rFonts w:ascii="Times New Roman" w:hAnsi="Times New Roman"/>
+          <w:sz w:val="24"/>
+        </w:rPr>
+        <w:t>5. Implementation / Modules</w:t>
+      </w:r>
+    </w:p>
+    <w:p>
+      <w:pPr>
+        <w:spacing w:line="360" w:lineRule="exact"/>
+      </w:pPr>
+      <w:r>
+        <w:rPr>
+          <w:rFonts w:ascii="Times New Roman" w:hAnsi="Times New Roman"/>
+          <w:sz w:val="24"/>
+        </w:rPr>
+        <w:t xml:space="preserve">    5.1 Public Portal</w:t>
+      </w:r>
+    </w:p>
+    <w:p>
+      <w:pPr>
+        <w:spacing w:line="360" w:lineRule="exact"/>
+      </w:pPr>
+      <w:r>
+        <w:rPr>
+          <w:rFonts w:ascii="Times New Roman" w:hAnsi="Times New Roman"/>
+          <w:sz w:val="24"/>
+        </w:rPr>
+        <w:t xml:space="preserve">    5.2 Citizen Portal</w:t>
+      </w:r>
+    </w:p>
+    <w:p>
+      <w:pPr>
+        <w:spacing w:line="360" w:lineRule="exact"/>
+      </w:pPr>
+      <w:r>
+        <w:rPr>
+          <w:rFonts w:ascii="Times New Roman" w:hAnsi="Times New Roman"/>
+          <w:sz w:val="24"/>
+        </w:rPr>
+        <w:t xml:space="preserve">    5.3 Admin Portal</w:t>
+      </w:r>
+    </w:p>
+    <w:p>
+      <w:pPr>
+        <w:spacing w:line="360" w:lineRule="exact"/>
+      </w:pPr>
+      <w:r>
+        <w:rPr>
+          <w:rFonts w:ascii="Times New Roman" w:hAnsi="Times New Roman"/>
+          <w:sz w:val="24"/>
+        </w:rPr>
+        <w:t xml:space="preserve">    5.4 Worker Portal</w:t>
+      </w:r>
+    </w:p>
+    <w:p>
+      <w:pPr>
+        <w:spacing w:line="360" w:lineRule="exact"/>
+      </w:pPr>
+      <w:r>
+        <w:rPr>
+          <w:rFonts w:ascii="Times New Roman" w:hAnsi="Times New Roman"/>
+          <w:sz w:val="24"/>
+        </w:rPr>
+        <w:t xml:space="preserve">    5.5 IoT Module</w:t>
+      </w:r>
+    </w:p>
+    <w:p>
+      <w:pPr>
+        <w:spacing w:line="360" w:lineRule="exact"/>
+      </w:pPr>
+      <w:r>
+        <w:rPr>
+          <w:rFonts w:ascii="Times New Roman" w:hAnsi="Times New Roman"/>
+          <w:sz w:val="24"/>
+        </w:rPr>
+        <w:t xml:space="preserve">    5.6 ML Module</w:t>
+      </w:r>
+    </w:p>
+    <w:p>
+      <w:pPr>
+        <w:spacing w:line="360" w:lineRule="exact"/>
+      </w:pPr>
+      <w:r>
+        <w:rPr>
+          <w:rFonts w:ascii="Times New Roman" w:hAnsi="Times New Roman"/>
+          <w:sz w:val="24"/>
+        </w:rPr>
+        <w:t xml:space="preserve">    5.7 Background Jobs</w:t>
+      </w:r>
+    </w:p>
+    <w:p>
+      <w:pPr>
+        <w:spacing w:line="360" w:lineRule="exact"/>
+      </w:pPr>
+      <w:r>
+        <w:rPr>
+          <w:rFonts w:ascii="Times New Roman" w:hAnsi="Times New Roman"/>
+          <w:sz w:val="24"/>
+        </w:rPr>
+        <w:t xml:space="preserve">    5.8 PWA Module</w:t>
+      </w:r>
+    </w:p>
+    <w:p>
+      <w:pPr>
+        <w:spacing w:line="360" w:lineRule="exact"/>
+      </w:pPr>
+      <w:r>
+        <w:rPr>
+          <w:rFonts w:ascii="Times New Roman" w:hAnsi="Times New Roman"/>
+          <w:sz w:val="24"/>
+        </w:rPr>
+        <w:t>6. Results / Outputs</w:t>
+      </w:r>
+    </w:p>
+    <w:p>
+      <w:pPr>
+        <w:spacing w:line="360" w:lineRule="exact"/>
+      </w:pPr>
+      <w:r>
+        <w:rPr>
+          <w:rFonts w:ascii="Times New Roman" w:hAnsi="Times New Roman"/>
+          <w:sz w:val="24"/>
+        </w:rPr>
+        <w:t xml:space="preserve">    6.1 Feature Status</w:t>
+      </w:r>
+    </w:p>
+    <w:p>
+      <w:pPr>
+        <w:spacing w:line="360" w:lineRule="exact"/>
+      </w:pPr>
+      <w:r>
+        <w:rPr>
+          <w:rFonts w:ascii="Times New Roman" w:hAnsi="Times New Roman"/>
+          <w:sz w:val="24"/>
+        </w:rPr>
+        <w:t xml:space="preserve">    6.2 System Outputs</w:t>
+      </w:r>
+    </w:p>
+    <w:p>
+      <w:pPr>
+        <w:spacing w:line="360" w:lineRule="exact"/>
+      </w:pPr>
+      <w:r>
+        <w:rPr>
+          <w:rFonts w:ascii="Times New Roman" w:hAnsi="Times New Roman"/>
+          <w:sz w:val="24"/>
+        </w:rPr>
+        <w:t xml:space="preserve">    6.3 Performance Metrics</w:t>
+      </w:r>
+    </w:p>
+    <w:p>
+      <w:pPr>
+        <w:spacing w:line="360" w:lineRule="exact"/>
+      </w:pPr>
+      <w:r>
+        <w:rPr>
+          <w:rFonts w:ascii="Times New Roman" w:hAnsi="Times New Roman"/>
+          <w:sz w:val="24"/>
+        </w:rPr>
+        <w:t xml:space="preserve">    6.4 Security Evaluation</w:t>
+      </w:r>
+    </w:p>
+    <w:p>
+      <w:pPr>
+        <w:spacing w:line="360" w:lineRule="exact"/>
+      </w:pPr>
+      <w:r>
+        <w:rPr>
+          <w:rFonts w:ascii="Times New Roman" w:hAnsi="Times New Roman"/>
+          <w:sz w:val="24"/>
+        </w:rPr>
+        <w:t xml:space="preserve">    6.5 Accessibility</w:t>
+      </w:r>
+    </w:p>
+    <w:p>
+      <w:pPr>
+        <w:spacing w:line="360" w:lineRule="exact"/>
+      </w:pPr>
+      <w:r>
+        <w:rPr>
+          <w:rFonts w:ascii="Times New Roman" w:hAnsi="Times New Roman"/>
+          <w:sz w:val="24"/>
+        </w:rPr>
+        <w:t>7. Impact Assessment</w:t>
+      </w:r>
+    </w:p>
+    <w:p>
+      <w:pPr>
+        <w:spacing w:line="360" w:lineRule="exact"/>
+      </w:pPr>
+      <w:r>
+        <w:rPr>
+          <w:rFonts w:ascii="Times New Roman" w:hAnsi="Times New Roman"/>
+          <w:sz w:val="24"/>
+        </w:rPr>
+        <w:t>8. Challenges Faced</w:t>
+      </w:r>
+    </w:p>
+    <w:p>
+      <w:pPr>
+        <w:spacing w:line="360" w:lineRule="exact"/>
+      </w:pPr>
+      <w:r>
+        <w:rPr>
+          <w:rFonts w:ascii="Times New Roman" w:hAnsi="Times New Roman"/>
+          <w:sz w:val="24"/>
+        </w:rPr>
+        <w:t>9. Conclusion</w:t>
+      </w:r>
+    </w:p>
+    <w:p>
+      <w:pPr>
+        <w:spacing w:line="360" w:lineRule="exact"/>
+      </w:pPr>
+      <w:r>
+        <w:rPr>
+          <w:rFonts w:ascii="Times New Roman" w:hAnsi="Times New Roman"/>
+          <w:sz w:val="24"/>
+        </w:rPr>
+        <w:t>10. Future Work</w:t>
+      </w:r>
+    </w:p>
+    <w:p>
+      <w:pPr>
+        <w:spacing w:line="360" w:lineRule="exact"/>
+      </w:pPr>
+      <w:r>
+        <w:rPr>
+          <w:rFonts w:ascii="Times New Roman" w:hAnsi="Times New Roman"/>
+          <w:sz w:val="24"/>
+        </w:rPr>
+        <w:t>References</w:t>
+      </w:r>
+    </w:p>
+    <w:p>
+      <w:pPr>
+        <w:spacing w:line="360" w:lineRule="exact"/>
+      </w:pPr>
+      <w:r>
+        <w:rPr>
+          <w:rFonts w:ascii="Times New Roman" w:hAnsi="Times New Roman"/>
+          <w:sz w:val="24"/>
+        </w:rPr>
+        <w:t>Appendix A: Tools and Packages</w:t>
+      </w:r>
+    </w:p>
+    <w:p>
+      <w:pPr>
+        <w:spacing w:line="360" w:lineRule="exact"/>
+      </w:pPr>
+      <w:r>
+        <w:rPr>
+          <w:rFonts w:ascii="Times New Roman" w:hAnsi="Times New Roman"/>
+          <w:sz w:val="24"/>
+        </w:rPr>
+        <w:t>Appendix B: Source Code</w:t>
+      </w:r>
+    </w:p>
     <w:p>
       <w:r>
         <w:br w:type="page"/>
@@ -5214,7 +5286,7 @@
           <w:i w:val="0"/>
           <w:sz w:val="24"/>
         </w:rPr>
-        <w:t>The system follows a monolithic Flask architecture with blueprint-based modular routing. The client layer (Browser/PWA) communicates via HTTPS through Cloudflare CDN to the application layer (Gunicorn + gevent WSGI server). The application consists of eight Flask blueprints: public, citizen, admin, worker, IoT, auth, analytics, and webhook. The data layer uses Supabase PostgreSQL via SQLAlchemy ORM with 23 models and 29 Alembic migrations.</w:t>
+        <w:t>The system follows a monolithic Flask architecture with blueprint-based modular routing. The client layer (Browser/PWA) communicates via HTTPS through Cloudflare CDN to the application layer (Gunicorn + gevent WSGI server). The application consists of eight route modules (public, citizen, admin, worker, IoT, auth, analytics, and webhook) mounted on a single Flask application blueprint. The data layer uses Supabase PostgreSQL via SQLAlchemy ORM with 29 models and 30 Alembic migrations.</w:t>
       </w:r>
     </w:p>
     <w:p>
@@ -6277,6 +6349,77 @@
       </w:r>
     </w:p>
     <w:p>
+      <w:pPr>
+        <w:pStyle w:val="Heading2"/>
+        <w:spacing w:before="240" w:after="120"/>
+      </w:pPr>
+      <w:r>
+        <w:rPr>
+          <w:rFonts w:ascii="Times New Roman" w:hAnsi="Times New Roman"/>
+          <w:b/>
+          <w:color w:val="000000"/>
+          <w:sz w:val="28"/>
+        </w:rPr>
+        <w:t>4.9 Photo Validation Classifier and Reliability Automation</w:t>
+      </w:r>
+    </w:p>
+    <w:p>
+      <w:pPr>
+        <w:jc w:val="both"/>
+      </w:pPr>
+      <w:r>
+        <w:rPr>
+          <w:rFonts w:ascii="Times New Roman" w:hAnsi="Times New Roman"/>
+          <w:b w:val="0"/>
+          <w:i w:val="0"/>
+          <w:sz w:val="24"/>
+        </w:rPr>
+        <w:t>Complaint photos are the primary evidence in the platform, but not every uploaded image is useful: selfies, screenshots, indoor scenes and blank frames would otherwise reach the worker queue as false dispatches. To protect that queue, SmartGarbage runs a second, independent deep-learning model ahead of complaint storage - a two-class photo-validation classifier (the "photo gate").</w:t>
+      </w:r>
+    </w:p>
+    <w:p>
+      <w:pPr>
+        <w:jc w:val="both"/>
+      </w:pPr>
+      <w:r>
+        <w:rPr>
+          <w:rFonts w:ascii="Times New Roman" w:hAnsi="Times New Roman"/>
+          <w:b w:val="0"/>
+          <w:i w:val="0"/>
+          <w:sz w:val="24"/>
+        </w:rPr>
+        <w:t>Runtime contract: the uploaded image is opened with Pillow, converted to RGB, resized to 224x224 pixels, scaled to the [0,1] range, normalised with the ImageNet mean (0.485, 0.456, 0.406) and standard deviation (0.229, 0.224, 0.225), and laid out as an NCHW tensor. An ONNX Runtime session bundled with the application (app/photo_classifier.onnx plus a photo_classifier.onnx.json sidecar that declares the labels, the reject label, the input size and the preprocessing contract) returns a two-class softmax; the reported score p_reject is the probability that the image is non-garbage, and a photo is accepted only when p_reject &lt; PHOTO_CLASSIFIER_THRESHOLD (default 0.70). Every rejection is logged with a thumbnail to the admin photo-rejection monitor and retained as a retraining candidate, so the gate improves from its own mistakes.</w:t>
+      </w:r>
+    </w:p>
+    <w:p>
+      <w:pPr>
+        <w:jc w:val="both"/>
+      </w:pPr>
+      <w:r>
+        <w:rPr>
+          <w:rFonts w:ascii="Times New Roman" w:hAnsi="Times New Roman"/>
+          <w:b w:val="0"/>
+          <w:i w:val="0"/>
+          <w:sz w:val="24"/>
+        </w:rPr>
+        <w:t>Training and evaluation: scripts/train_photo_classifier.py transfer-learns a compact convolutional network and exports it to ONNX, using the same 224x224 resize at validation time as at runtime so the measured accuracy reflects the deployed contract. The shipped model was retrained with domain hard negatives ("Streets in India" / "Roads in India" clean scenes and dump-yard frames) and reached 96.6% top-1 validation accuracy across approximately 4,300 images.</w:t>
+      </w:r>
+    </w:p>
+    <w:p>
+      <w:pPr>
+        <w:jc w:val="both"/>
+      </w:pPr>
+      <w:r>
+        <w:rPr>
+          <w:rFonts w:ascii="Times New Roman" w:hAnsi="Times New Roman"/>
+          <w:b w:val="0"/>
+          <w:i w:val="0"/>
+          <w:sz w:val="24"/>
+        </w:rPr>
+        <w:t>Reliability automation (MLOps): three safeguards keep the gate honest. (1) Two canary probes embedded in app/jobs.py - a known non-garbage image that must be rejected and a known garbage image that must be accepted - are scored on a schedule; a breach raises day-deduplicated email/SMS alerts. (2) A weekly drift tracker compares the live p_reject distribution against a signed baseline (scripts/photo_classifier_baseline.json) and warns when the mean shifts by more than 0.01, when the floor drops by more than 0.005 below the baseline minimum, or when any score falls below 0.90; a breach files a labelled GitHub issue. (3) A closed retraining loop exports relabelled false positives as a batch archive, ingests them exactly once through a SHA-256 ledger, enforces a validation-accuracy gate (default 0.90) before promoting a new model, and refreshes the drift baseline; the entire loop is triggered from a manual GitHub Actions workflow that opens a review pull request.</w:t>
+      </w:r>
+    </w:p>
+    <w:p>
       <w:r>
         <w:br w:type="page"/>
       </w:r>
@@ -6750,6 +6893,63 @@
           <w:sz w:val="24"/>
         </w:rPr>
         <w:t>Technology: Service Worker API, IndexedDB.</w:t>
+      </w:r>
+    </w:p>
+    <w:p>
+      <w:pPr>
+        <w:pStyle w:val="Heading2"/>
+        <w:spacing w:before="240" w:after="120"/>
+      </w:pPr>
+      <w:r>
+        <w:rPr>
+          <w:rFonts w:ascii="Times New Roman" w:hAnsi="Times New Roman"/>
+          <w:b/>
+          <w:color w:val="000000"/>
+          <w:sz w:val="28"/>
+        </w:rPr>
+        <w:t>5.9 Photo Validation &amp; Classifier Lifecycle</w:t>
+      </w:r>
+    </w:p>
+    <w:p>
+      <w:pPr>
+        <w:jc w:val="both"/>
+      </w:pPr>
+      <w:r>
+        <w:rPr>
+          <w:rFonts w:ascii="Times New Roman" w:hAnsi="Times New Roman"/>
+          <w:b/>
+          <w:i w:val="0"/>
+          <w:sz w:val="24"/>
+        </w:rPr>
+        <w:t>Purpose: Validate complaint photos and keep the classifier trustworthy over time.</w:t>
+      </w:r>
+    </w:p>
+    <w:p>
+      <w:pPr>
+        <w:jc w:val="both"/>
+      </w:pPr>
+      <w:r>
+        <w:rPr>
+          <w:rFonts w:ascii="Times New Roman" w:hAnsi="Times New Roman"/>
+          <w:b w:val="0"/>
+          <w:i w:val="0"/>
+          <w:sz w:val="24"/>
+        </w:rPr>
+        <w:t>Functions: ONNX photo gate at p_reject &lt; 0.70; admin photo-rejection monitor with thumbnails; dual canary probes; weekly p_reject drift tracker; exactly-once retrain-batch ingest with a validation-accuracy gate and auto-refreshed baseline.</w:t>
+      </w:r>
+    </w:p>
+    <w:p>
+      <w:pPr>
+        <w:jc w:val="both"/>
+      </w:pPr>
+      <w:r>
+        <w:rPr>
+          <w:rFonts w:ascii="Times New Roman" w:hAnsi="Times New Roman"/>
+          <w:b w:val="0"/>
+          <w:i w:val="0"/>
+          <w:sz w:val="24"/>
+        </w:rPr>
+        <w:t>Technology: ONNX Runtime, Pillow, GitHub Actions.</w:t>
       </w:r>
     </w:p>
     <w:p>
@@ -7417,6 +7617,59 @@
                 <w:rFonts w:ascii="Times New Roman" w:hAnsi="Times New Roman"/>
                 <w:sz w:val="24"/>
               </w:rPr>
+              <w:t>Photo Validation Classifier</w:t>
+            </w:r>
+          </w:p>
+        </w:tc>
+        <w:tc>
+          <w:tcPr>
+            <w:tcW w:type="dxa" w:w="3001"/>
+          </w:tcPr>
+          <w:p>
+            <w:pPr>
+              <w:spacing w:line="280" w:lineRule="exact"/>
+            </w:pPr>
+            <w:r>
+              <w:rPr>
+                <w:rFonts w:ascii="Times New Roman" w:hAnsi="Times New Roman"/>
+                <w:sz w:val="24"/>
+              </w:rPr>
+              <w:t>Implemented</w:t>
+            </w:r>
+          </w:p>
+        </w:tc>
+        <w:tc>
+          <w:tcPr>
+            <w:tcW w:type="dxa" w:w="3001"/>
+          </w:tcPr>
+          <w:p>
+            <w:pPr>
+              <w:spacing w:line="280" w:lineRule="exact"/>
+            </w:pPr>
+            <w:r>
+              <w:rPr>
+                <w:rFonts w:ascii="Times New Roman" w:hAnsi="Times New Roman"/>
+                <w:sz w:val="24"/>
+              </w:rPr>
+              <w:t>ONNX gate, p_reject &lt; 0.70</w:t>
+            </w:r>
+          </w:p>
+        </w:tc>
+      </w:tr>
+      <w:tr>
+        <w:tc>
+          <w:tcPr>
+            <w:tcW w:type="dxa" w:w="3001"/>
+          </w:tcPr>
+          <w:p>
+            <w:pPr>
+              <w:spacing w:line="280" w:lineRule="exact"/>
+            </w:pPr>
+            <w:r>
+              <w:rPr>
+                <w:rFonts w:ascii="Times New Roman" w:hAnsi="Times New Roman"/>
+                <w:sz w:val="24"/>
+              </w:rPr>
               <w:t>Green Points</w:t>
             </w:r>
           </w:p>
@@ -10131,7 +10384,757 @@
           <w:color w:val="000000"/>
           <w:sz w:val="28"/>
         </w:rPr>
-        <w:t>6.6 System Output Screenshots</w:t>
+        <w:t>6.6 Photo-Gate Reliability and Classifier Results</w:t>
+      </w:r>
+    </w:p>
+    <w:p>
+      <w:pPr>
+        <w:jc w:val="both"/>
+      </w:pPr>
+      <w:r>
+        <w:rPr>
+          <w:rFonts w:ascii="Times New Roman" w:hAnsi="Times New Roman"/>
+          <w:b w:val="0"/>
+          <w:i w:val="0"/>
+          <w:sz w:val="24"/>
+        </w:rPr>
+        <w:t>The photo-validation classifier was evaluated against the deployed runtime contract (224x224 ImageNet-normalised input, ONNX Runtime inference) so the numbers below describe the model actually serving traffic, not a training-time proxy.</w:t>
+      </w:r>
+    </w:p>
+    <w:tbl>
+      <w:tblPr>
+        <w:tblStyle w:val="TableGrid"/>
+        <w:tblW w:type="auto" w:w="0"/>
+        <w:jc w:val="center"/>
+        <w:tblLook w:firstColumn="1" w:firstRow="1" w:lastColumn="0" w:lastRow="0" w:noHBand="0" w:noVBand="1" w:val="04A0"/>
+      </w:tblPr>
+      <w:tblGrid>
+        <w:gridCol w:w="3001"/>
+        <w:gridCol w:w="3001"/>
+        <w:gridCol w:w="3001"/>
+      </w:tblGrid>
+      <w:tr>
+        <w:tc>
+          <w:tcPr>
+            <w:tcW w:type="dxa" w:w="3001"/>
+          </w:tcPr>
+          <w:p>
+            <w:pPr>
+              <w:spacing w:line="280" w:lineRule="exact"/>
+              <w:jc w:val="center"/>
+            </w:pPr>
+            <w:r>
+              <w:rPr>
+                <w:rFonts w:ascii="Times New Roman" w:hAnsi="Times New Roman"/>
+                <w:b/>
+                <w:sz w:val="24"/>
+              </w:rPr>
+              <w:t>Metric</w:t>
+            </w:r>
+          </w:p>
+        </w:tc>
+        <w:tc>
+          <w:tcPr>
+            <w:tcW w:type="dxa" w:w="3001"/>
+          </w:tcPr>
+          <w:p>
+            <w:pPr>
+              <w:spacing w:line="280" w:lineRule="exact"/>
+              <w:jc w:val="center"/>
+            </w:pPr>
+            <w:r>
+              <w:rPr>
+                <w:rFonts w:ascii="Times New Roman" w:hAnsi="Times New Roman"/>
+                <w:b/>
+                <w:sz w:val="24"/>
+              </w:rPr>
+              <w:t>Value</w:t>
+            </w:r>
+          </w:p>
+        </w:tc>
+        <w:tc>
+          <w:tcPr>
+            <w:tcW w:type="dxa" w:w="3001"/>
+          </w:tcPr>
+          <w:p>
+            <w:pPr>
+              <w:spacing w:line="280" w:lineRule="exact"/>
+              <w:jc w:val="center"/>
+            </w:pPr>
+            <w:r>
+              <w:rPr>
+                <w:rFonts w:ascii="Times New Roman" w:hAnsi="Times New Roman"/>
+                <w:b/>
+                <w:sz w:val="24"/>
+              </w:rPr>
+              <w:t>Basis</w:t>
+            </w:r>
+          </w:p>
+        </w:tc>
+      </w:tr>
+      <w:tr>
+        <w:tc>
+          <w:tcPr>
+            <w:tcW w:type="dxa" w:w="3001"/>
+          </w:tcPr>
+          <w:p>
+            <w:pPr>
+              <w:spacing w:line="280" w:lineRule="exact"/>
+            </w:pPr>
+            <w:r>
+              <w:rPr>
+                <w:rFonts w:ascii="Times New Roman" w:hAnsi="Times New Roman"/>
+                <w:sz w:val="24"/>
+              </w:rPr>
+              <w:t>Validation top-1 accuracy</w:t>
+            </w:r>
+          </w:p>
+        </w:tc>
+        <w:tc>
+          <w:tcPr>
+            <w:tcW w:type="dxa" w:w="3001"/>
+          </w:tcPr>
+          <w:p>
+            <w:pPr>
+              <w:spacing w:line="280" w:lineRule="exact"/>
+            </w:pPr>
+            <w:r>
+              <w:rPr>
+                <w:rFonts w:ascii="Times New Roman" w:hAnsi="Times New Roman"/>
+                <w:sz w:val="24"/>
+              </w:rPr>
+              <w:t>96.6%</w:t>
+            </w:r>
+          </w:p>
+        </w:tc>
+        <w:tc>
+          <w:tcPr>
+            <w:tcW w:type="dxa" w:w="3001"/>
+          </w:tcPr>
+          <w:p>
+            <w:pPr>
+              <w:spacing w:line="280" w:lineRule="exact"/>
+            </w:pPr>
+            <w:r>
+              <w:rPr>
+                <w:rFonts w:ascii="Times New Roman" w:hAnsi="Times New Roman"/>
+                <w:sz w:val="24"/>
+              </w:rPr>
+              <w:t>Hard-negative retrain, ~4,300 images</w:t>
+            </w:r>
+          </w:p>
+        </w:tc>
+      </w:tr>
+      <w:tr>
+        <w:tc>
+          <w:tcPr>
+            <w:tcW w:type="dxa" w:w="3001"/>
+          </w:tcPr>
+          <w:p>
+            <w:pPr>
+              <w:spacing w:line="280" w:lineRule="exact"/>
+            </w:pPr>
+            <w:r>
+              <w:rPr>
+                <w:rFonts w:ascii="Times New Roman" w:hAnsi="Times New Roman"/>
+                <w:sz w:val="24"/>
+              </w:rPr>
+              <w:t>Canary p_reject (non-garbage probe)</w:t>
+            </w:r>
+          </w:p>
+        </w:tc>
+        <w:tc>
+          <w:tcPr>
+            <w:tcW w:type="dxa" w:w="3001"/>
+          </w:tcPr>
+          <w:p>
+            <w:pPr>
+              <w:spacing w:line="280" w:lineRule="exact"/>
+            </w:pPr>
+            <w:r>
+              <w:rPr>
+                <w:rFonts w:ascii="Times New Roman" w:hAnsi="Times New Roman"/>
+                <w:sz w:val="24"/>
+              </w:rPr>
+              <w:t>0.99983</w:t>
+            </w:r>
+          </w:p>
+        </w:tc>
+        <w:tc>
+          <w:tcPr>
+            <w:tcW w:type="dxa" w:w="3001"/>
+          </w:tcPr>
+          <w:p>
+            <w:pPr>
+              <w:spacing w:line="280" w:lineRule="exact"/>
+            </w:pPr>
+            <w:r>
+              <w:rPr>
+                <w:rFonts w:ascii="Times New Roman" w:hAnsi="Times New Roman"/>
+                <w:sz w:val="24"/>
+              </w:rPr>
+              <w:t>Live scoring of the reject canary (range 0.9998-1.0000)</w:t>
+            </w:r>
+          </w:p>
+        </w:tc>
+      </w:tr>
+      <w:tr>
+        <w:tc>
+          <w:tcPr>
+            <w:tcW w:type="dxa" w:w="3001"/>
+          </w:tcPr>
+          <w:p>
+            <w:pPr>
+              <w:spacing w:line="280" w:lineRule="exact"/>
+            </w:pPr>
+            <w:r>
+              <w:rPr>
+                <w:rFonts w:ascii="Times New Roman" w:hAnsi="Times New Roman"/>
+                <w:sz w:val="24"/>
+              </w:rPr>
+              <w:t>Validation-set p_reject (scored)</w:t>
+            </w:r>
+          </w:p>
+        </w:tc>
+        <w:tc>
+          <w:tcPr>
+            <w:tcW w:type="dxa" w:w="3001"/>
+          </w:tcPr>
+          <w:p>
+            <w:pPr>
+              <w:spacing w:line="280" w:lineRule="exact"/>
+            </w:pPr>
+            <w:r>
+              <w:rPr>
+                <w:rFonts w:ascii="Times New Roman" w:hAnsi="Times New Roman"/>
+                <w:sz w:val="24"/>
+              </w:rPr>
+              <w:t>n=302, mean 0.9964, min 0.7693</w:t>
+            </w:r>
+          </w:p>
+        </w:tc>
+        <w:tc>
+          <w:tcPr>
+            <w:tcW w:type="dxa" w:w="3001"/>
+          </w:tcPr>
+          <w:p>
+            <w:pPr>
+              <w:spacing w:line="280" w:lineRule="exact"/>
+            </w:pPr>
+            <w:r>
+              <w:rPr>
+                <w:rFonts w:ascii="Times New Roman" w:hAnsi="Times New Roman"/>
+                <w:sz w:val="24"/>
+              </w:rPr>
+              <w:t>Rejected validation images</w:t>
+            </w:r>
+          </w:p>
+        </w:tc>
+      </w:tr>
+      <w:tr>
+        <w:tc>
+          <w:tcPr>
+            <w:tcW w:type="dxa" w:w="3001"/>
+          </w:tcPr>
+          <w:p>
+            <w:pPr>
+              <w:spacing w:line="280" w:lineRule="exact"/>
+            </w:pPr>
+            <w:r>
+              <w:rPr>
+                <w:rFonts w:ascii="Times New Roman" w:hAnsi="Times New Roman"/>
+                <w:sz w:val="24"/>
+              </w:rPr>
+              <w:t>Acceptance threshold</w:t>
+            </w:r>
+          </w:p>
+        </w:tc>
+        <w:tc>
+          <w:tcPr>
+            <w:tcW w:type="dxa" w:w="3001"/>
+          </w:tcPr>
+          <w:p>
+            <w:pPr>
+              <w:spacing w:line="280" w:lineRule="exact"/>
+            </w:pPr>
+            <w:r>
+              <w:rPr>
+                <w:rFonts w:ascii="Times New Roman" w:hAnsi="Times New Roman"/>
+                <w:sz w:val="24"/>
+              </w:rPr>
+              <w:t>p_reject &lt; 0.70</w:t>
+            </w:r>
+          </w:p>
+        </w:tc>
+        <w:tc>
+          <w:tcPr>
+            <w:tcW w:type="dxa" w:w="3001"/>
+          </w:tcPr>
+          <w:p>
+            <w:pPr>
+              <w:spacing w:line="280" w:lineRule="exact"/>
+            </w:pPr>
+            <w:r>
+              <w:rPr>
+                <w:rFonts w:ascii="Times New Roman" w:hAnsi="Times New Roman"/>
+                <w:sz w:val="24"/>
+              </w:rPr>
+              <w:t>PHOTO_CLASSIFIER_THRESHOLD default</w:t>
+            </w:r>
+          </w:p>
+        </w:tc>
+      </w:tr>
+    </w:tbl>
+    <w:p>
+      <w:pPr>
+        <w:jc w:val="center"/>
+      </w:pPr>
+      <w:r>
+        <w:rPr>
+          <w:rFonts w:ascii="Times New Roman" w:hAnsi="Times New Roman"/>
+          <w:b/>
+          <w:sz w:val="24"/>
+        </w:rPr>
+        <w:t>Table 6.6: Photo-Validation Classifier Evaluation</w:t>
+      </w:r>
+    </w:p>
+    <w:p/>
+    <w:p>
+      <w:pPr>
+        <w:jc w:val="both"/>
+      </w:pPr>
+      <w:r>
+        <w:rPr>
+          <w:rFonts w:ascii="Times New Roman" w:hAnsi="Times New Roman"/>
+          <w:b w:val="0"/>
+          <w:i w:val="0"/>
+          <w:sz w:val="24"/>
+        </w:rPr>
+        <w:t>Reliability automation was exercised end to end: the canary probes run on schedule with day-deduplicated alerting, the weekly drift tracker compares live p_reject against the signed baseline, and the retrain-batch ingest was verified to be exactly-once and idempotent.</w:t>
+      </w:r>
+    </w:p>
+    <w:tbl>
+      <w:tblPr>
+        <w:tblStyle w:val="TableGrid"/>
+        <w:tblW w:type="auto" w:w="0"/>
+        <w:jc w:val="center"/>
+        <w:tblLook w:firstColumn="1" w:firstRow="1" w:lastColumn="0" w:lastRow="0" w:noHBand="0" w:noVBand="1" w:val="04A0"/>
+      </w:tblPr>
+      <w:tblGrid>
+        <w:gridCol w:w="3001"/>
+        <w:gridCol w:w="3001"/>
+        <w:gridCol w:w="3001"/>
+      </w:tblGrid>
+      <w:tr>
+        <w:tc>
+          <w:tcPr>
+            <w:tcW w:type="dxa" w:w="3001"/>
+          </w:tcPr>
+          <w:p>
+            <w:pPr>
+              <w:spacing w:line="280" w:lineRule="exact"/>
+              <w:jc w:val="center"/>
+            </w:pPr>
+            <w:r>
+              <w:rPr>
+                <w:rFonts w:ascii="Times New Roman" w:hAnsi="Times New Roman"/>
+                <w:b/>
+                <w:sz w:val="24"/>
+              </w:rPr>
+              <w:t>Safeguard</w:t>
+            </w:r>
+          </w:p>
+        </w:tc>
+        <w:tc>
+          <w:tcPr>
+            <w:tcW w:type="dxa" w:w="3001"/>
+          </w:tcPr>
+          <w:p>
+            <w:pPr>
+              <w:spacing w:line="280" w:lineRule="exact"/>
+              <w:jc w:val="center"/>
+            </w:pPr>
+            <w:r>
+              <w:rPr>
+                <w:rFonts w:ascii="Times New Roman" w:hAnsi="Times New Roman"/>
+                <w:b/>
+                <w:sz w:val="24"/>
+              </w:rPr>
+              <w:t>Mechanism</w:t>
+            </w:r>
+          </w:p>
+        </w:tc>
+        <w:tc>
+          <w:tcPr>
+            <w:tcW w:type="dxa" w:w="3001"/>
+          </w:tcPr>
+          <w:p>
+            <w:pPr>
+              <w:spacing w:line="280" w:lineRule="exact"/>
+              <w:jc w:val="center"/>
+            </w:pPr>
+            <w:r>
+              <w:rPr>
+                <w:rFonts w:ascii="Times New Roman" w:hAnsi="Times New Roman"/>
+                <w:b/>
+                <w:sz w:val="24"/>
+              </w:rPr>
+              <w:t>Status</w:t>
+            </w:r>
+          </w:p>
+        </w:tc>
+      </w:tr>
+      <w:tr>
+        <w:tc>
+          <w:tcPr>
+            <w:tcW w:type="dxa" w:w="3001"/>
+          </w:tcPr>
+          <w:p>
+            <w:pPr>
+              <w:spacing w:line="280" w:lineRule="exact"/>
+            </w:pPr>
+            <w:r>
+              <w:rPr>
+                <w:rFonts w:ascii="Times New Roman" w:hAnsi="Times New Roman"/>
+                <w:sz w:val="24"/>
+              </w:rPr>
+              <w:t>Reject canary</w:t>
+            </w:r>
+          </w:p>
+        </w:tc>
+        <w:tc>
+          <w:tcPr>
+            <w:tcW w:type="dxa" w:w="3001"/>
+          </w:tcPr>
+          <w:p>
+            <w:pPr>
+              <w:spacing w:line="280" w:lineRule="exact"/>
+            </w:pPr>
+            <w:r>
+              <w:rPr>
+                <w:rFonts w:ascii="Times New Roman" w:hAnsi="Times New Roman"/>
+                <w:sz w:val="24"/>
+              </w:rPr>
+              <w:t>Non-garbage probe must score above threshold</w:t>
+            </w:r>
+          </w:p>
+        </w:tc>
+        <w:tc>
+          <w:tcPr>
+            <w:tcW w:type="dxa" w:w="3001"/>
+          </w:tcPr>
+          <w:p>
+            <w:pPr>
+              <w:spacing w:line="280" w:lineRule="exact"/>
+            </w:pPr>
+            <w:r>
+              <w:rPr>
+                <w:rFonts w:ascii="Times New Roman" w:hAnsi="Times New Roman"/>
+                <w:sz w:val="24"/>
+              </w:rPr>
+              <w:t>Live</w:t>
+            </w:r>
+          </w:p>
+        </w:tc>
+      </w:tr>
+      <w:tr>
+        <w:tc>
+          <w:tcPr>
+            <w:tcW w:type="dxa" w:w="3001"/>
+          </w:tcPr>
+          <w:p>
+            <w:pPr>
+              <w:spacing w:line="280" w:lineRule="exact"/>
+            </w:pPr>
+            <w:r>
+              <w:rPr>
+                <w:rFonts w:ascii="Times New Roman" w:hAnsi="Times New Roman"/>
+                <w:sz w:val="24"/>
+              </w:rPr>
+              <w:t>Accept canary</w:t>
+            </w:r>
+          </w:p>
+        </w:tc>
+        <w:tc>
+          <w:tcPr>
+            <w:tcW w:type="dxa" w:w="3001"/>
+          </w:tcPr>
+          <w:p>
+            <w:pPr>
+              <w:spacing w:line="280" w:lineRule="exact"/>
+            </w:pPr>
+            <w:r>
+              <w:rPr>
+                <w:rFonts w:ascii="Times New Roman" w:hAnsi="Times New Roman"/>
+                <w:sz w:val="24"/>
+              </w:rPr>
+              <w:t>Garbage probe must be accepted</w:t>
+            </w:r>
+          </w:p>
+        </w:tc>
+        <w:tc>
+          <w:tcPr>
+            <w:tcW w:type="dxa" w:w="3001"/>
+          </w:tcPr>
+          <w:p>
+            <w:pPr>
+              <w:spacing w:line="280" w:lineRule="exact"/>
+            </w:pPr>
+            <w:r>
+              <w:rPr>
+                <w:rFonts w:ascii="Times New Roman" w:hAnsi="Times New Roman"/>
+                <w:sz w:val="24"/>
+              </w:rPr>
+              <w:t>Live</w:t>
+            </w:r>
+          </w:p>
+        </w:tc>
+      </w:tr>
+      <w:tr>
+        <w:tc>
+          <w:tcPr>
+            <w:tcW w:type="dxa" w:w="3001"/>
+          </w:tcPr>
+          <w:p>
+            <w:pPr>
+              <w:spacing w:line="280" w:lineRule="exact"/>
+            </w:pPr>
+            <w:r>
+              <w:rPr>
+                <w:rFonts w:ascii="Times New Roman" w:hAnsi="Times New Roman"/>
+                <w:sz w:val="24"/>
+              </w:rPr>
+              <w:t>Threshold-drift tracker</w:t>
+            </w:r>
+          </w:p>
+        </w:tc>
+        <w:tc>
+          <w:tcPr>
+            <w:tcW w:type="dxa" w:w="3001"/>
+          </w:tcPr>
+          <w:p>
+            <w:pPr>
+              <w:spacing w:line="280" w:lineRule="exact"/>
+            </w:pPr>
+            <w:r>
+              <w:rPr>
+                <w:rFonts w:ascii="Times New Roman" w:hAnsi="Times New Roman"/>
+                <w:sz w:val="24"/>
+              </w:rPr>
+              <w:t>Weekly p_reject vs signed baseline; issue on breach</w:t>
+            </w:r>
+          </w:p>
+        </w:tc>
+        <w:tc>
+          <w:tcPr>
+            <w:tcW w:type="dxa" w:w="3001"/>
+          </w:tcPr>
+          <w:p>
+            <w:pPr>
+              <w:spacing w:line="280" w:lineRule="exact"/>
+            </w:pPr>
+            <w:r>
+              <w:rPr>
+                <w:rFonts w:ascii="Times New Roman" w:hAnsi="Times New Roman"/>
+                <w:sz w:val="24"/>
+              </w:rPr>
+              <w:t>Live</w:t>
+            </w:r>
+          </w:p>
+        </w:tc>
+      </w:tr>
+      <w:tr>
+        <w:tc>
+          <w:tcPr>
+            <w:tcW w:type="dxa" w:w="3001"/>
+          </w:tcPr>
+          <w:p>
+            <w:pPr>
+              <w:spacing w:line="280" w:lineRule="exact"/>
+            </w:pPr>
+            <w:r>
+              <w:rPr>
+                <w:rFonts w:ascii="Times New Roman" w:hAnsi="Times New Roman"/>
+                <w:sz w:val="24"/>
+              </w:rPr>
+              <w:t>Retrain-batch ingest</w:t>
+            </w:r>
+          </w:p>
+        </w:tc>
+        <w:tc>
+          <w:tcPr>
+            <w:tcW w:type="dxa" w:w="3001"/>
+          </w:tcPr>
+          <w:p>
+            <w:pPr>
+              <w:spacing w:line="280" w:lineRule="exact"/>
+            </w:pPr>
+            <w:r>
+              <w:rPr>
+                <w:rFonts w:ascii="Times New Roman" w:hAnsi="Times New Roman"/>
+                <w:sz w:val="24"/>
+              </w:rPr>
+              <w:t>SHA-256 exactly-once ledger, &gt;=48px validation</w:t>
+            </w:r>
+          </w:p>
+        </w:tc>
+        <w:tc>
+          <w:tcPr>
+            <w:tcW w:type="dxa" w:w="3001"/>
+          </w:tcPr>
+          <w:p>
+            <w:pPr>
+              <w:spacing w:line="280" w:lineRule="exact"/>
+            </w:pPr>
+            <w:r>
+              <w:rPr>
+                <w:rFonts w:ascii="Times New Roman" w:hAnsi="Times New Roman"/>
+                <w:sz w:val="24"/>
+              </w:rPr>
+              <w:t>Live</w:t>
+            </w:r>
+          </w:p>
+        </w:tc>
+      </w:tr>
+      <w:tr>
+        <w:tc>
+          <w:tcPr>
+            <w:tcW w:type="dxa" w:w="3001"/>
+          </w:tcPr>
+          <w:p>
+            <w:pPr>
+              <w:spacing w:line="280" w:lineRule="exact"/>
+            </w:pPr>
+            <w:r>
+              <w:rPr>
+                <w:rFonts w:ascii="Times New Roman" w:hAnsi="Times New Roman"/>
+                <w:sz w:val="24"/>
+              </w:rPr>
+              <w:t>Promotion gate</w:t>
+            </w:r>
+          </w:p>
+        </w:tc>
+        <w:tc>
+          <w:tcPr>
+            <w:tcW w:type="dxa" w:w="3001"/>
+          </w:tcPr>
+          <w:p>
+            <w:pPr>
+              <w:spacing w:line="280" w:lineRule="exact"/>
+            </w:pPr>
+            <w:r>
+              <w:rPr>
+                <w:rFonts w:ascii="Times New Roman" w:hAnsi="Times New Roman"/>
+                <w:sz w:val="24"/>
+              </w:rPr>
+              <w:t>Validation accuracy &gt;= 0.90 required to ship</w:t>
+            </w:r>
+          </w:p>
+        </w:tc>
+        <w:tc>
+          <w:tcPr>
+            <w:tcW w:type="dxa" w:w="3001"/>
+          </w:tcPr>
+          <w:p>
+            <w:pPr>
+              <w:spacing w:line="280" w:lineRule="exact"/>
+            </w:pPr>
+            <w:r>
+              <w:rPr>
+                <w:rFonts w:ascii="Times New Roman" w:hAnsi="Times New Roman"/>
+                <w:sz w:val="24"/>
+              </w:rPr>
+              <w:t>Live</w:t>
+            </w:r>
+          </w:p>
+        </w:tc>
+      </w:tr>
+      <w:tr>
+        <w:tc>
+          <w:tcPr>
+            <w:tcW w:type="dxa" w:w="3001"/>
+          </w:tcPr>
+          <w:p>
+            <w:pPr>
+              <w:spacing w:line="280" w:lineRule="exact"/>
+            </w:pPr>
+            <w:r>
+              <w:rPr>
+                <w:rFonts w:ascii="Times New Roman" w:hAnsi="Times New Roman"/>
+                <w:sz w:val="24"/>
+              </w:rPr>
+              <w:t>Baseline refresh</w:t>
+            </w:r>
+          </w:p>
+        </w:tc>
+        <w:tc>
+          <w:tcPr>
+            <w:tcW w:type="dxa" w:w="3001"/>
+          </w:tcPr>
+          <w:p>
+            <w:pPr>
+              <w:spacing w:line="280" w:lineRule="exact"/>
+            </w:pPr>
+            <w:r>
+              <w:rPr>
+                <w:rFonts w:ascii="Times New Roman" w:hAnsi="Times New Roman"/>
+                <w:sz w:val="24"/>
+              </w:rPr>
+              <w:t>Auto-refreshed after each promoted retrain</w:t>
+            </w:r>
+          </w:p>
+        </w:tc>
+        <w:tc>
+          <w:tcPr>
+            <w:tcW w:type="dxa" w:w="3001"/>
+          </w:tcPr>
+          <w:p>
+            <w:pPr>
+              <w:spacing w:line="280" w:lineRule="exact"/>
+            </w:pPr>
+            <w:r>
+              <w:rPr>
+                <w:rFonts w:ascii="Times New Roman" w:hAnsi="Times New Roman"/>
+                <w:sz w:val="24"/>
+              </w:rPr>
+              <w:t>Live</w:t>
+            </w:r>
+          </w:p>
+        </w:tc>
+      </w:tr>
+    </w:tbl>
+    <w:p>
+      <w:pPr>
+        <w:jc w:val="center"/>
+      </w:pPr>
+      <w:r>
+        <w:rPr>
+          <w:rFonts w:ascii="Times New Roman" w:hAnsi="Times New Roman"/>
+          <w:b/>
+          <w:sz w:val="24"/>
+        </w:rPr>
+        <w:t>Table 6.7: Classifier Reliability Safeguards</w:t>
+      </w:r>
+    </w:p>
+    <w:p/>
+    <w:p>
+      <w:r>
+        <w:br w:type="page"/>
+      </w:r>
+    </w:p>
+    <w:p>
+      <w:pPr>
+        <w:pStyle w:val="Heading2"/>
+        <w:spacing w:before="240" w:after="120"/>
+      </w:pPr>
+      <w:r>
+        <w:rPr>
+          <w:rFonts w:ascii="Times New Roman" w:hAnsi="Times New Roman"/>
+          <w:b/>
+          <w:color w:val="000000"/>
+          <w:sz w:val="28"/>
+        </w:rPr>
+        <w:t>6.7 System Output Screenshots</w:t>
       </w:r>
     </w:p>
     <w:p>
@@ -12029,6 +13032,59 @@
           </w:p>
         </w:tc>
       </w:tr>
+      <w:tr>
+        <w:tc>
+          <w:tcPr>
+            <w:tcW w:type="dxa" w:w="3001"/>
+          </w:tcPr>
+          <w:p>
+            <w:pPr>
+              <w:spacing w:line="280" w:lineRule="exact"/>
+            </w:pPr>
+            <w:r>
+              <w:rPr>
+                <w:rFonts w:ascii="Times New Roman" w:hAnsi="Times New Roman"/>
+                <w:sz w:val="24"/>
+              </w:rPr>
+              <w:t>Keeping the photo gate trustworthy</w:t>
+            </w:r>
+          </w:p>
+        </w:tc>
+        <w:tc>
+          <w:tcPr>
+            <w:tcW w:type="dxa" w:w="3001"/>
+          </w:tcPr>
+          <w:p>
+            <w:pPr>
+              <w:spacing w:line="280" w:lineRule="exact"/>
+            </w:pPr>
+            <w:r>
+              <w:rPr>
+                <w:rFonts w:ascii="Times New Roman" w:hAnsi="Times New Roman"/>
+                <w:sz w:val="24"/>
+              </w:rPr>
+              <w:t>MLOps</w:t>
+            </w:r>
+          </w:p>
+        </w:tc>
+        <w:tc>
+          <w:tcPr>
+            <w:tcW w:type="dxa" w:w="3001"/>
+          </w:tcPr>
+          <w:p>
+            <w:pPr>
+              <w:spacing w:line="280" w:lineRule="exact"/>
+            </w:pPr>
+            <w:r>
+              <w:rPr>
+                <w:rFonts w:ascii="Times New Roman" w:hAnsi="Times New Roman"/>
+                <w:sz w:val="24"/>
+              </w:rPr>
+              <w:t>Canary probes + weekly drift tracker + gated retrain loop</w:t>
+            </w:r>
+          </w:p>
+        </w:tc>
+      </w:tr>
     </w:tbl>
     <w:p>
       <w:pPr>
@@ -12075,7 +13131,7 @@
           <w:i w:val="0"/>
           <w:sz w:val="24"/>
         </w:rPr>
-        <w:t>This project developed SmartGarbage Chintalavalasa — an integrated, open-source waste management portal for the five wards of Chintalavalasa Gram Panchayat. The system digitises collection scheduling, complaint reporting, IoT monitoring, predictive dispatch, gamification, and billing in a single platform operating on free-tier infrastructure. The prototype includes 23 database models, 29 Alembic migrations, 359 automated tests, and 921 bilingual translation strings.</w:t>
+        <w:t>This project developed SmartGarbage Chintalavalasa — an integrated, open-source waste management portal for the five wards of Chintalavalasa Gram Panchayat. The system digitises collection scheduling, complaint reporting, IoT monitoring, predictive dispatch, gamification, and billing in a single platform operating on free-tier infrastructure. The prototype includes 29 database models, 30 Alembic migrations, 406 automated tests, and 921 bilingual translation strings.</w:t>
       </w:r>
     </w:p>
     <w:p>
@@ -12208,6 +13264,20 @@
           <w:sz w:val="24"/>
         </w:rPr>
         <w:t>6. Government API integration: Connect with the AP State SBM portal for automated compliance reporting.</w:t>
+      </w:r>
+    </w:p>
+    <w:p>
+      <w:pPr>
+        <w:jc w:val="both"/>
+      </w:pPr>
+      <w:r>
+        <w:rPr>
+          <w:rFonts w:ascii="Times New Roman" w:hAnsi="Times New Roman"/>
+          <w:b w:val="0"/>
+          <w:i w:val="0"/>
+          <w:sz w:val="24"/>
+        </w:rPr>
+        <w:t>7. Continuous classifier improvement: Automate the review-and-merge step of the retrain pull requests and widen the hard-negative corpus with live mislabelled complaints.</w:t>
       </w:r>
     </w:p>
     <w:p>
@@ -14061,7 +15131,60 @@
                 <w:rFonts w:ascii="Times New Roman" w:hAnsi="Times New Roman"/>
                 <w:sz w:val="24"/>
               </w:rPr>
-              <w:t>ORM and 22 schema migrations</w:t>
+              <w:t>ORM and 30 schema migrations</w:t>
+            </w:r>
+          </w:p>
+        </w:tc>
+      </w:tr>
+      <w:tr>
+        <w:tc>
+          <w:tcPr>
+            <w:tcW w:type="dxa" w:w="3001"/>
+          </w:tcPr>
+          <w:p>
+            <w:pPr>
+              <w:spacing w:line="280" w:lineRule="exact"/>
+            </w:pPr>
+            <w:r>
+              <w:rPr>
+                <w:rFonts w:ascii="Times New Roman" w:hAnsi="Times New Roman"/>
+                <w:sz w:val="24"/>
+              </w:rPr>
+              <w:t>ML (photo gate)</w:t>
+            </w:r>
+          </w:p>
+        </w:tc>
+        <w:tc>
+          <w:tcPr>
+            <w:tcW w:type="dxa" w:w="3001"/>
+          </w:tcPr>
+          <w:p>
+            <w:pPr>
+              <w:spacing w:line="280" w:lineRule="exact"/>
+            </w:pPr>
+            <w:r>
+              <w:rPr>
+                <w:rFonts w:ascii="Times New Roman" w:hAnsi="Times New Roman"/>
+                <w:sz w:val="24"/>
+              </w:rPr>
+              <w:t>ONNX Runtime + Pillow</w:t>
+            </w:r>
+          </w:p>
+        </w:tc>
+        <w:tc>
+          <w:tcPr>
+            <w:tcW w:type="dxa" w:w="3001"/>
+          </w:tcPr>
+          <w:p>
+            <w:pPr>
+              <w:spacing w:line="280" w:lineRule="exact"/>
+            </w:pPr>
+            <w:r>
+              <w:rPr>
+                <w:rFonts w:ascii="Times New Roman" w:hAnsi="Times New Roman"/>
+                <w:sz w:val="24"/>
+              </w:rPr>
+              <w:t>Complaint-photo validation classifier</w:t>
             </w:r>
           </w:p>
         </w:tc>
@@ -14452,7 +15575,7 @@
           <w:i w:val="0"/>
           <w:sz w:val="24"/>
         </w:rPr>
-        <w:t>3. Backend setup: Flask application factory with seven route blueprints and RBAC decorators.</w:t>
+        <w:t>3. Backend setup: Flask application factory with eight route modules mounted on a single application blueprint, with RBAC decorators.</w:t>
       </w:r>
     </w:p>
     <w:p>
@@ -14466,7 +15589,7 @@
           <w:i w:val="0"/>
           <w:sz w:val="24"/>
         </w:rPr>
-        <w:t>4. Database schema: 23 SQLAlchemy models with 29 Alembic migrations on PostgreSQL (Supabase).</w:t>
+        <w:t>4. Database schema: 29 SQLAlchemy models with 30 Alembic migrations on PostgreSQL (Supabase).</w:t>
       </w:r>
     </w:p>
     <w:p>
@@ -14508,7 +15631,7 @@
           <w:i w:val="0"/>
           <w:sz w:val="24"/>
         </w:rPr>
-        <w:t>7. PWA offline layer: service worker (v14) cache tiers, IndexedDB complaint queue, background sync on reconnect.</w:t>
+        <w:t>7. PWA offline layer: service worker (v16) two-tier same-origin cache plus an allowlisted CDN tier (web font + map tiles), IndexedDB complaint queue, background sync on reconnect.</w:t>
       </w:r>
     </w:p>
     <w:p>
@@ -14536,7 +15659,7 @@
           <w:i w:val="0"/>
           <w:sz w:val="24"/>
         </w:rPr>
-        <w:t>9. Testing: 359 automated tests run by pytest with Postgres parity via run_pg_suite.py; flake8 lint in CI.</w:t>
+        <w:t>9. Testing: 406 automated tests run by pytest with Postgres parity via run_pg_suite.py; flake8 lint in CI.</w:t>
       </w:r>
     </w:p>
     <w:p>
@@ -14773,7 +15896,7 @@
                 <w:rFonts w:ascii="Times New Roman" w:hAnsi="Times New Roman"/>
                 <w:sz w:val="24"/>
               </w:rPr>
-              <w:t>23 database models</w:t>
+              <w:t>29 database models</w:t>
             </w:r>
           </w:p>
         </w:tc>
@@ -15286,7 +16409,7 @@
                 <w:rFonts w:ascii="Times New Roman" w:hAnsi="Times New Roman"/>
                 <w:sz w:val="24"/>
               </w:rPr>
-              <w:t>5 files</w:t>
+              <w:t>7 files</w:t>
             </w:r>
           </w:p>
         </w:tc>
@@ -15303,7 +16426,7 @@
                 <w:rFonts w:ascii="Times New Roman" w:hAnsi="Times New Roman"/>
                 <w:sz w:val="24"/>
               </w:rPr>
-              <w:t>359 test functions</w:t>
+              <w:t>406 test functions</w:t>
             </w:r>
           </w:p>
         </w:tc>
@@ -15339,7 +16462,7 @@
                 <w:rFonts w:ascii="Times New Roman" w:hAnsi="Times New Roman"/>
                 <w:sz w:val="24"/>
               </w:rPr>
-              <w:t>29</w:t>
+              <w:t>30</w:t>
             </w:r>
           </w:p>
         </w:tc>
@@ -15436,7 +16559,7 @@
           <w:rFonts w:ascii="Courier New" w:hAnsi="Courier New"/>
           <w:sz w:val="17"/>
         </w:rPr>
-        <w:t xml:space="preserve">    # On ANY production platform (Render OR Fly.io) the HMAC secret is</w:t>
+        <w:t xml:space="preserve">    # On any production deployment the HMAC secret is</w:t>
       </w:r>
     </w:p>
     <w:p>
@@ -15963,7 +17086,7 @@
           <w:i w:val="0"/>
           <w:sz w:val="24"/>
         </w:rPr>
-        <w:t>Three-tier caching with LRU eviction powers the offline-first PWA:</w:t>
+        <w:t>Two-tier same-origin caching with LRU eviction powers the offline-first PWA: immutable static assets (cache-first) and HTML pages (stale-while-revalidate). A small allowlisted CDN tier additionally cache-firsts the web font and OpenStreetMap tiles so they survive offline. Every other cross-origin request is deliberately NOT intercepted, so resources such as Google Tag Manager load straight from the network.</w:t>
       </w:r>
     </w:p>
     <w:p>
@@ -15975,7 +17098,7 @@
           <w:rFonts w:ascii="Courier New" w:hAnsi="Courier New"/>
           <w:sz w:val="17"/>
         </w:rPr>
-        <w:t>const SW_VERSION = 'v14';</w:t>
+        <w:t>/* ================================================================</w:t>
       </w:r>
     </w:p>
     <w:p>
@@ -15987,7 +17110,43 @@
           <w:rFonts w:ascii="Courier New" w:hAnsi="Courier New"/>
           <w:sz w:val="17"/>
         </w:rPr>
-        <w:t>const CACHE_PREFIX = 'smartgarbage';</w:t>
+        <w:t xml:space="preserve">   SmartGarbage Service Worker v16</w:t>
+      </w:r>
+    </w:p>
+    <w:p>
+      <w:pPr>
+        <w:spacing w:after="0" w:before="0" w:line="240" w:lineRule="auto"/>
+      </w:pPr>
+      <w:r>
+        <w:rPr>
+          <w:rFonts w:ascii="Courier New" w:hAnsi="Courier New"/>
+          <w:sz w:val="17"/>
+        </w:rPr>
+        <w:t xml:space="preserve">   Two-tier same-origin caching (static assets + HTML pages) plus a small</w:t>
+      </w:r>
+    </w:p>
+    <w:p>
+      <w:pPr>
+        <w:spacing w:after="0" w:before="0" w:line="240" w:lineRule="auto"/>
+      </w:pPr>
+      <w:r>
+        <w:rPr>
+          <w:rFonts w:ascii="Courier New" w:hAnsi="Courier New"/>
+          <w:sz w:val="17"/>
+        </w:rPr>
+        <w:t xml:space="preserve">   cache-first tier for an explicit allowlist of external assets (web font,</w:t>
+      </w:r>
+    </w:p>
+    <w:p>
+      <w:pPr>
+        <w:spacing w:after="0" w:before="0" w:line="240" w:lineRule="auto"/>
+      </w:pPr>
+      <w:r>
+        <w:rPr>
+          <w:rFonts w:ascii="Courier New" w:hAnsi="Courier New"/>
+          <w:sz w:val="17"/>
+        </w:rPr>
+        <w:t xml:space="preserve">   OpenStreetMap tiles) so they survive offline.</w:t>
       </w:r>
     </w:p>
     <w:p>
@@ -16011,7 +17170,7 @@
           <w:rFonts w:ascii="Courier New" w:hAnsi="Courier New"/>
           <w:sz w:val="17"/>
         </w:rPr>
-        <w:t>// ── Cache tiers ──────────────────────────────────────────────────</w:t>
+        <w:t xml:space="preserve">   Only that allowlist is intercepted. Everything else cross-origin — notably</w:t>
       </w:r>
     </w:p>
     <w:p>
@@ -16023,7 +17182,7 @@
           <w:rFonts w:ascii="Courier New" w:hAnsi="Courier New"/>
           <w:sz w:val="17"/>
         </w:rPr>
-        <w:t>const STATIC_CACHE  = `${CACHE_PREFIX}-static-${SW_VERSION}`;   // Immutable assets</w:t>
+        <w:t xml:space="preserve">   Google Tag Manager / Analytics and third-party scripts — is left to the</w:t>
       </w:r>
     </w:p>
     <w:p>
@@ -16035,7 +17194,7 @@
           <w:rFonts w:ascii="Courier New" w:hAnsi="Courier New"/>
           <w:sz w:val="17"/>
         </w:rPr>
-        <w:t>const PAGES_CACHE   = `${CACHE_PREFIX}-pages-${SW_VERSION}`;    // HTML pages</w:t>
+        <w:t xml:space="preserve">   browser: routing those through this worker's own fetch() subjected them to</w:t>
       </w:r>
     </w:p>
     <w:p>
@@ -16047,7 +17206,31 @@
           <w:rFonts w:ascii="Courier New" w:hAnsi="Courier New"/>
           <w:sz w:val="17"/>
         </w:rPr>
-        <w:t>const CDN_CACHE     = `${CACHE_PREFIX}-cdn-${SW_VERSION}`;      // External CDN</w:t>
+        <w:t xml:space="preserve">   the worker's CSP policy container (which inherited a narrow connect-src and</w:t>
+      </w:r>
+    </w:p>
+    <w:p>
+      <w:pPr>
+        <w:spacing w:after="0" w:before="0" w:line="240" w:lineRule="auto"/>
+      </w:pPr>
+      <w:r>
+        <w:rPr>
+          <w:rFonts w:ascii="Courier New" w:hAnsi="Courier New"/>
+          <w:sz w:val="17"/>
+        </w:rPr>
+        <w:t xml:space="preserve">   blocked hosts such as www.googletagmanager.com with net::ERR_FAILED).</w:t>
+      </w:r>
+    </w:p>
+    <w:p>
+      <w:pPr>
+        <w:spacing w:after="0" w:before="0" w:line="240" w:lineRule="auto"/>
+      </w:pPr>
+      <w:r>
+        <w:rPr>
+          <w:rFonts w:ascii="Courier New" w:hAnsi="Courier New"/>
+          <w:sz w:val="17"/>
+        </w:rPr>
+        <w:t xml:space="preserve">   ================================================================ */</w:t>
       </w:r>
     </w:p>
     <w:p>
@@ -16071,43 +17254,7 @@
           <w:rFonts w:ascii="Courier New" w:hAnsi="Courier New"/>
           <w:sz w:val="17"/>
         </w:rPr>
-        <w:t>// ── Cache size limits (LRU eviction) ────────────────────────────</w:t>
-      </w:r>
-    </w:p>
-    <w:p>
-      <w:pPr>
-        <w:spacing w:after="0" w:before="0" w:line="240" w:lineRule="auto"/>
-      </w:pPr>
-      <w:r>
-        <w:rPr>
-          <w:rFonts w:ascii="Courier New" w:hAnsi="Courier New"/>
-          <w:sz w:val="17"/>
-        </w:rPr>
-        <w:t>const MAX_STATIC_ENTRIES = 80;</w:t>
-      </w:r>
-    </w:p>
-    <w:p>
-      <w:pPr>
-        <w:spacing w:after="0" w:before="0" w:line="240" w:lineRule="auto"/>
-      </w:pPr>
-      <w:r>
-        <w:rPr>
-          <w:rFonts w:ascii="Courier New" w:hAnsi="Courier New"/>
-          <w:sz w:val="17"/>
-        </w:rPr>
-        <w:t>const MAX_PAGES_ENTRIES  = 30;</w:t>
-      </w:r>
-    </w:p>
-    <w:p>
-      <w:pPr>
-        <w:spacing w:after="0" w:before="0" w:line="240" w:lineRule="auto"/>
-      </w:pPr>
-      <w:r>
-        <w:rPr>
-          <w:rFonts w:ascii="Courier New" w:hAnsi="Courier New"/>
-          <w:sz w:val="17"/>
-        </w:rPr>
-        <w:t>const MAX_CDN_ENTRIES    = 20;</w:t>
+        <w:t>const SW_VERSION = 'v16';</w:t>
       </w:r>
     </w:p>
     <w:p/>

</xml_diff>